<commit_message>
Lab04: react-query + api client + tickets list/details integration
</commit_message>
<xml_diff>
--- a/steps.docx
+++ b/steps.docx
@@ -3091,6 +3091,634 @@
       <w:proofErr w:type="spellEnd"/>
       <w:r>
         <w:t> сразу возвращал непустой список.</w:t>
+      </w:r>
+      <w:r>
+        <w:br/>
+      </w:r>
+    </w:p>
+    <w:p>
+      <w:r>
+        <w:br w:type="page"/>
+      </w:r>
+    </w:p>
+    <w:p>
+      <w:pPr>
+        <w:pBdr>
+          <w:top w:val="single" w:sz="6" w:space="1" w:color="auto"/>
+          <w:bottom w:val="single" w:sz="6" w:space="1" w:color="auto"/>
+        </w:pBdr>
+        <w:spacing w:after="0" w:line="240" w:lineRule="auto"/>
+        <w:rPr>
+          <w:lang w:val="en-US"/>
+        </w:rPr>
+      </w:pPr>
+    </w:p>
+    <w:p>
+      <w:pPr>
+        <w:spacing w:after="0" w:line="240" w:lineRule="auto"/>
+      </w:pPr>
+      <w:r>
+        <w:t>Сделал lab04 на клиенте и проверил сборки.</w:t>
+      </w:r>
+    </w:p>
+    <w:p>
+      <w:pPr>
+        <w:spacing w:after="0" w:line="240" w:lineRule="auto"/>
+        <w:rPr>
+          <w:b/>
+          <w:bCs/>
+        </w:rPr>
+      </w:pPr>
+      <w:r>
+        <w:rPr>
+          <w:b/>
+          <w:bCs/>
+        </w:rPr>
+        <w:t>Что реализовано</w:t>
+      </w:r>
+    </w:p>
+    <w:p>
+      <w:pPr>
+        <w:numPr>
+          <w:ilvl w:val="0"/>
+          <w:numId w:val="82"/>
+        </w:numPr>
+        <w:spacing w:after="0" w:line="240" w:lineRule="auto"/>
+      </w:pPr>
+      <w:r>
+        <w:t>Добавил </w:t>
+      </w:r>
+      <w:proofErr w:type="spellStart"/>
+      <w:r>
+        <w:rPr>
+          <w:b/>
+          <w:bCs/>
+        </w:rPr>
+        <w:t>TanStack</w:t>
+      </w:r>
+      <w:proofErr w:type="spellEnd"/>
+      <w:r>
+        <w:rPr>
+          <w:b/>
+          <w:bCs/>
+        </w:rPr>
+        <w:t xml:space="preserve"> </w:t>
+      </w:r>
+      <w:proofErr w:type="spellStart"/>
+      <w:r>
+        <w:rPr>
+          <w:b/>
+          <w:bCs/>
+        </w:rPr>
+        <w:t>Query</w:t>
+      </w:r>
+      <w:proofErr w:type="spellEnd"/>
+      <w:r>
+        <w:t>:</w:t>
+      </w:r>
+    </w:p>
+    <w:p>
+      <w:pPr>
+        <w:numPr>
+          <w:ilvl w:val="0"/>
+          <w:numId w:val="83"/>
+        </w:numPr>
+        <w:spacing w:after="0" w:line="240" w:lineRule="auto"/>
+      </w:pPr>
+      <w:r>
+        <w:t>зависимость @tanstack/react-query в </w:t>
+      </w:r>
+      <w:proofErr w:type="spellStart"/>
+      <w:r>
+        <w:t>client</w:t>
+      </w:r>
+      <w:proofErr w:type="spellEnd"/>
+      <w:r>
+        <w:t>/</w:t>
+      </w:r>
+      <w:proofErr w:type="spellStart"/>
+      <w:r>
+        <w:t>package.json</w:t>
+      </w:r>
+      <w:proofErr w:type="spellEnd"/>
+    </w:p>
+    <w:p>
+      <w:pPr>
+        <w:numPr>
+          <w:ilvl w:val="0"/>
+          <w:numId w:val="84"/>
+        </w:numPr>
+        <w:spacing w:after="0" w:line="240" w:lineRule="auto"/>
+        <w:rPr>
+          <w:lang w:val="en-US"/>
+        </w:rPr>
+      </w:pPr>
+      <w:r>
+        <w:rPr>
+          <w:lang w:val="en-US"/>
+        </w:rPr>
+        <w:t>QueryClientProvider </w:t>
+      </w:r>
+      <w:r>
+        <w:t>в</w:t>
+      </w:r>
+      <w:r>
+        <w:rPr>
+          <w:lang w:val="en-US"/>
+        </w:rPr>
+        <w:t> client/src/main.tsx</w:t>
+      </w:r>
+    </w:p>
+    <w:p>
+      <w:pPr>
+        <w:numPr>
+          <w:ilvl w:val="0"/>
+          <w:numId w:val="85"/>
+        </w:numPr>
+        <w:spacing w:after="0" w:line="240" w:lineRule="auto"/>
+        <w:rPr>
+          <w:lang w:val="en-US"/>
+        </w:rPr>
+      </w:pPr>
+      <w:r>
+        <w:t>Сделал</w:t>
+      </w:r>
+      <w:r>
+        <w:rPr>
+          <w:lang w:val="en-US"/>
+        </w:rPr>
+        <w:t xml:space="preserve"> API client </w:t>
+      </w:r>
+      <w:r>
+        <w:t>с</w:t>
+      </w:r>
+      <w:r>
+        <w:rPr>
+          <w:lang w:val="en-US"/>
+        </w:rPr>
+        <w:t> VITE_API_BASE_URL:</w:t>
+      </w:r>
+    </w:p>
+    <w:p>
+      <w:pPr>
+        <w:numPr>
+          <w:ilvl w:val="0"/>
+          <w:numId w:val="86"/>
+        </w:numPr>
+        <w:spacing w:after="0" w:line="240" w:lineRule="auto"/>
+      </w:pPr>
+      <w:proofErr w:type="spellStart"/>
+      <w:r>
+        <w:t>client</w:t>
+      </w:r>
+      <w:proofErr w:type="spellEnd"/>
+      <w:r>
+        <w:t>/</w:t>
+      </w:r>
+      <w:proofErr w:type="spellStart"/>
+      <w:r>
+        <w:t>src</w:t>
+      </w:r>
+      <w:proofErr w:type="spellEnd"/>
+      <w:r>
+        <w:t>/</w:t>
+      </w:r>
+      <w:proofErr w:type="spellStart"/>
+      <w:r>
+        <w:t>api</w:t>
+      </w:r>
+      <w:proofErr w:type="spellEnd"/>
+      <w:r>
+        <w:t>/</w:t>
+      </w:r>
+      <w:proofErr w:type="spellStart"/>
+      <w:r>
+        <w:t>httpClient.ts</w:t>
+      </w:r>
+      <w:proofErr w:type="spellEnd"/>
+    </w:p>
+    <w:p>
+      <w:pPr>
+        <w:numPr>
+          <w:ilvl w:val="0"/>
+          <w:numId w:val="87"/>
+        </w:numPr>
+        <w:spacing w:after="0" w:line="240" w:lineRule="auto"/>
+      </w:pPr>
+      <w:proofErr w:type="spellStart"/>
+      <w:r>
+        <w:t>client</w:t>
+      </w:r>
+      <w:proofErr w:type="spellEnd"/>
+      <w:r>
+        <w:t>/</w:t>
+      </w:r>
+      <w:proofErr w:type="spellStart"/>
+      <w:r>
+        <w:t>src</w:t>
+      </w:r>
+      <w:proofErr w:type="spellEnd"/>
+      <w:r>
+        <w:t>/</w:t>
+      </w:r>
+      <w:proofErr w:type="spellStart"/>
+      <w:r>
+        <w:t>api</w:t>
+      </w:r>
+      <w:proofErr w:type="spellEnd"/>
+      <w:r>
+        <w:t>/</w:t>
+      </w:r>
+      <w:proofErr w:type="spellStart"/>
+      <w:r>
+        <w:t>tickets.ts</w:t>
+      </w:r>
+      <w:proofErr w:type="spellEnd"/>
+    </w:p>
+    <w:p>
+      <w:pPr>
+        <w:numPr>
+          <w:ilvl w:val="0"/>
+          <w:numId w:val="88"/>
+        </w:numPr>
+        <w:spacing w:after="0" w:line="240" w:lineRule="auto"/>
+      </w:pPr>
+      <w:r>
+        <w:t>используется </w:t>
+      </w:r>
+      <w:proofErr w:type="gramStart"/>
+      <w:r>
+        <w:t>import.meta.env.VITE</w:t>
+      </w:r>
+      <w:proofErr w:type="gramEnd"/>
+      <w:r>
+        <w:t>_API_BASE_URL (fallback: http://localhost:8080)</w:t>
+      </w:r>
+    </w:p>
+    <w:p>
+      <w:pPr>
+        <w:numPr>
+          <w:ilvl w:val="0"/>
+          <w:numId w:val="89"/>
+        </w:numPr>
+        <w:spacing w:after="0" w:line="240" w:lineRule="auto"/>
+      </w:pPr>
+      <w:r>
+        <w:t>Подключил реальные данные:</w:t>
+      </w:r>
+    </w:p>
+    <w:p>
+      <w:pPr>
+        <w:numPr>
+          <w:ilvl w:val="0"/>
+          <w:numId w:val="90"/>
+        </w:numPr>
+        <w:spacing w:after="0" w:line="240" w:lineRule="auto"/>
+        <w:rPr>
+          <w:lang w:val="en-US"/>
+        </w:rPr>
+      </w:pPr>
+      <w:r>
+        <w:rPr>
+          <w:lang w:val="en-US"/>
+        </w:rPr>
+        <w:t>/</w:t>
+      </w:r>
+      <w:proofErr w:type="gramStart"/>
+      <w:r>
+        <w:rPr>
+          <w:lang w:val="en-US"/>
+        </w:rPr>
+        <w:t>tickets</w:t>
+      </w:r>
+      <w:proofErr w:type="gramEnd"/>
+      <w:r>
+        <w:rPr>
+          <w:lang w:val="en-US"/>
+        </w:rPr>
+        <w:t> </w:t>
+      </w:r>
+      <w:r>
+        <w:t>грузит</w:t>
+      </w:r>
+      <w:r>
+        <w:rPr>
+          <w:lang w:val="en-US"/>
+        </w:rPr>
+        <w:t> GET /api/tickets </w:t>
+      </w:r>
+      <w:r>
+        <w:t>в</w:t>
+      </w:r>
+      <w:r>
+        <w:rPr>
+          <w:lang w:val="en-US"/>
+        </w:rPr>
+        <w:t> client/src/pages/TicketsListPage.tsx</w:t>
+      </w:r>
+    </w:p>
+    <w:p>
+      <w:pPr>
+        <w:numPr>
+          <w:ilvl w:val="0"/>
+          <w:numId w:val="91"/>
+        </w:numPr>
+        <w:spacing w:after="0" w:line="240" w:lineRule="auto"/>
+        <w:rPr>
+          <w:lang w:val="en-US"/>
+        </w:rPr>
+      </w:pPr>
+      <w:r>
+        <w:rPr>
+          <w:lang w:val="en-US"/>
+        </w:rPr>
+        <w:t>/tickets/:id </w:t>
+      </w:r>
+      <w:r>
+        <w:t>грузит</w:t>
+      </w:r>
+      <w:r>
+        <w:rPr>
+          <w:lang w:val="en-US"/>
+        </w:rPr>
+        <w:t> GET /api/tickets/{id} </w:t>
+      </w:r>
+      <w:r>
+        <w:t>в</w:t>
+      </w:r>
+      <w:r>
+        <w:rPr>
+          <w:lang w:val="en-US"/>
+        </w:rPr>
+        <w:t> client/src/pages/TicketDetailsPage.tsx</w:t>
+      </w:r>
+    </w:p>
+    <w:p>
+      <w:pPr>
+        <w:numPr>
+          <w:ilvl w:val="0"/>
+          <w:numId w:val="92"/>
+        </w:numPr>
+        <w:spacing w:after="0" w:line="240" w:lineRule="auto"/>
+      </w:pPr>
+      <w:r>
+        <w:t>Обработал состояния:</w:t>
+      </w:r>
+    </w:p>
+    <w:p>
+      <w:pPr>
+        <w:numPr>
+          <w:ilvl w:val="0"/>
+          <w:numId w:val="93"/>
+        </w:numPr>
+        <w:spacing w:after="0" w:line="240" w:lineRule="auto"/>
+      </w:pPr>
+      <w:proofErr w:type="spellStart"/>
+      <w:r>
+        <w:t>loading</w:t>
+      </w:r>
+      <w:proofErr w:type="spellEnd"/>
+      <w:r>
+        <w:t> / </w:t>
+      </w:r>
+      <w:proofErr w:type="spellStart"/>
+      <w:r>
+        <w:t>empty</w:t>
+      </w:r>
+      <w:proofErr w:type="spellEnd"/>
+      <w:r>
+        <w:t xml:space="preserve"> / </w:t>
+      </w:r>
+      <w:proofErr w:type="spellStart"/>
+      <w:r>
+        <w:t>error</w:t>
+      </w:r>
+      <w:proofErr w:type="spellEnd"/>
+      <w:r>
+        <w:t> для списка</w:t>
+      </w:r>
+    </w:p>
+    <w:p>
+      <w:pPr>
+        <w:numPr>
+          <w:ilvl w:val="0"/>
+          <w:numId w:val="94"/>
+        </w:numPr>
+        <w:spacing w:after="0" w:line="240" w:lineRule="auto"/>
+        <w:rPr>
+          <w:lang w:val="en-US"/>
+        </w:rPr>
+      </w:pPr>
+      <w:r>
+        <w:rPr>
+          <w:lang w:val="en-US"/>
+        </w:rPr>
+        <w:t>loading / error / not found </w:t>
+      </w:r>
+      <w:r>
+        <w:t>для</w:t>
+      </w:r>
+      <w:r>
+        <w:rPr>
+          <w:lang w:val="en-US"/>
+        </w:rPr>
+        <w:t> </w:t>
+      </w:r>
+      <w:r>
+        <w:t>карточки</w:t>
+      </w:r>
+    </w:p>
+    <w:p>
+      <w:pPr>
+        <w:numPr>
+          <w:ilvl w:val="0"/>
+          <w:numId w:val="95"/>
+        </w:numPr>
+        <w:spacing w:after="0" w:line="240" w:lineRule="auto"/>
+        <w:rPr>
+          <w:lang w:val="en-US"/>
+        </w:rPr>
+      </w:pPr>
+      <w:r>
+        <w:t>Обновил</w:t>
+      </w:r>
+      <w:r>
+        <w:rPr>
+          <w:lang w:val="en-US"/>
+        </w:rPr>
+        <w:t xml:space="preserve"> README </w:t>
+      </w:r>
+      <w:r>
+        <w:t>по</w:t>
+      </w:r>
+      <w:r>
+        <w:rPr>
+          <w:lang w:val="en-US"/>
+        </w:rPr>
+        <w:t> VITE_API_BASE_URL:</w:t>
+      </w:r>
+    </w:p>
+    <w:p>
+      <w:pPr>
+        <w:numPr>
+          <w:ilvl w:val="0"/>
+          <w:numId w:val="96"/>
+        </w:numPr>
+        <w:spacing w:after="0" w:line="240" w:lineRule="auto"/>
+      </w:pPr>
+      <w:r>
+        <w:t>client/README.md</w:t>
+      </w:r>
+    </w:p>
+    <w:p>
+      <w:pPr>
+        <w:numPr>
+          <w:ilvl w:val="0"/>
+          <w:numId w:val="97"/>
+        </w:numPr>
+        <w:spacing w:after="0" w:line="240" w:lineRule="auto"/>
+      </w:pPr>
+      <w:r>
+        <w:t>README.md (корневой)</w:t>
+      </w:r>
+    </w:p>
+    <w:p>
+      <w:pPr>
+        <w:spacing w:after="0" w:line="240" w:lineRule="auto"/>
+        <w:rPr>
+          <w:b/>
+          <w:bCs/>
+        </w:rPr>
+      </w:pPr>
+      <w:r>
+        <w:rPr>
+          <w:b/>
+          <w:bCs/>
+        </w:rPr>
+        <w:t>Проверки</w:t>
+      </w:r>
+    </w:p>
+    <w:p>
+      <w:pPr>
+        <w:numPr>
+          <w:ilvl w:val="0"/>
+          <w:numId w:val="98"/>
+        </w:numPr>
+        <w:spacing w:after="0" w:line="240" w:lineRule="auto"/>
+        <w:rPr>
+          <w:lang w:val="en-US"/>
+        </w:rPr>
+      </w:pPr>
+      <w:r>
+        <w:rPr>
+          <w:lang w:val="en-US"/>
+        </w:rPr>
+        <w:t>npm run build </w:t>
+      </w:r>
+      <w:r>
+        <w:t>в</w:t>
+      </w:r>
+      <w:r>
+        <w:rPr>
+          <w:lang w:val="en-US"/>
+        </w:rPr>
+        <w:t> client — </w:t>
+      </w:r>
+      <w:r>
+        <w:rPr>
+          <w:b/>
+          <w:bCs/>
+          <w:lang w:val="en-US"/>
+        </w:rPr>
+        <w:t>OK</w:t>
+      </w:r>
+    </w:p>
+    <w:p>
+      <w:pPr>
+        <w:numPr>
+          <w:ilvl w:val="0"/>
+          <w:numId w:val="99"/>
+        </w:numPr>
+        <w:spacing w:after="0" w:line="240" w:lineRule="auto"/>
+      </w:pPr>
+      <w:proofErr w:type="spellStart"/>
+      <w:r>
+        <w:t>dotnet</w:t>
+      </w:r>
+      <w:proofErr w:type="spellEnd"/>
+      <w:r>
+        <w:t xml:space="preserve"> </w:t>
+      </w:r>
+      <w:proofErr w:type="spellStart"/>
+      <w:r>
+        <w:t>build</w:t>
+      </w:r>
+      <w:proofErr w:type="spellEnd"/>
+      <w:r>
+        <w:t> в </w:t>
+      </w:r>
+      <w:proofErr w:type="spellStart"/>
+      <w:r>
+        <w:t>server</w:t>
+      </w:r>
+      <w:proofErr w:type="spellEnd"/>
+      <w:r>
+        <w:t> — </w:t>
+      </w:r>
+      <w:r>
+        <w:rPr>
+          <w:b/>
+          <w:bCs/>
+        </w:rPr>
+        <w:t>OK</w:t>
+      </w:r>
+    </w:p>
+    <w:p>
+      <w:pPr>
+        <w:spacing w:after="0" w:line="240" w:lineRule="auto"/>
+      </w:pPr>
+      <w:r>
+        <w:t>(первый запуск </w:t>
+      </w:r>
+      <w:proofErr w:type="spellStart"/>
+      <w:r>
+        <w:t>dotnet</w:t>
+      </w:r>
+      <w:proofErr w:type="spellEnd"/>
+      <w:r>
+        <w:t> </w:t>
+      </w:r>
+      <w:proofErr w:type="spellStart"/>
+      <w:r>
+        <w:t>build</w:t>
+      </w:r>
+      <w:proofErr w:type="spellEnd"/>
+      <w:r>
+        <w:t xml:space="preserve"> упал из-за </w:t>
+      </w:r>
+      <w:proofErr w:type="spellStart"/>
+      <w:r>
+        <w:t>lock</w:t>
+      </w:r>
+      <w:proofErr w:type="spellEnd"/>
+      <w:r>
+        <w:t>-а </w:t>
+      </w:r>
+      <w:proofErr w:type="spellStart"/>
+      <w:r>
+        <w:t>dll</w:t>
+      </w:r>
+      <w:proofErr w:type="spellEnd"/>
+      <w:r>
+        <w:t> от запущенного </w:t>
+      </w:r>
+      <w:proofErr w:type="spellStart"/>
+      <w:r>
+        <w:t>ServiceDesk.Api</w:t>
+      </w:r>
+      <w:proofErr w:type="spellEnd"/>
+      <w:r>
+        <w:t>, повторный запуск прошёл успешно)</w:t>
       </w:r>
     </w:p>
     <w:sectPr>
@@ -3255,6 +3883,155 @@
     </w:lvl>
   </w:abstractNum>
   <w:abstractNum w:abstractNumId="1" w15:restartNumberingAfterBreak="0">
+    <w:nsid w:val="05931142"/>
+    <w:multiLevelType w:val="multilevel"/>
+    <w:tmpl w:val="6C9E7082"/>
+    <w:lvl w:ilvl="0">
+      <w:start w:val="1"/>
+      <w:numFmt w:val="bullet"/>
+      <w:lvlText w:val=""/>
+      <w:lvlJc w:val="left"/>
+      <w:pPr>
+        <w:tabs>
+          <w:tab w:val="num" w:pos="720"/>
+        </w:tabs>
+        <w:ind w:left="720" w:hanging="360"/>
+      </w:pPr>
+      <w:rPr>
+        <w:rFonts w:ascii="Symbol" w:hAnsi="Symbol" w:hint="default"/>
+        <w:sz w:val="20"/>
+      </w:rPr>
+    </w:lvl>
+    <w:lvl w:ilvl="1" w:tentative="1">
+      <w:start w:val="1"/>
+      <w:numFmt w:val="bullet"/>
+      <w:lvlText w:val="o"/>
+      <w:lvlJc w:val="left"/>
+      <w:pPr>
+        <w:tabs>
+          <w:tab w:val="num" w:pos="1440"/>
+        </w:tabs>
+        <w:ind w:left="1440" w:hanging="360"/>
+      </w:pPr>
+      <w:rPr>
+        <w:rFonts w:ascii="Courier New" w:hAnsi="Courier New" w:hint="default"/>
+        <w:sz w:val="20"/>
+      </w:rPr>
+    </w:lvl>
+    <w:lvl w:ilvl="2" w:tentative="1">
+      <w:start w:val="1"/>
+      <w:numFmt w:val="bullet"/>
+      <w:lvlText w:val=""/>
+      <w:lvlJc w:val="left"/>
+      <w:pPr>
+        <w:tabs>
+          <w:tab w:val="num" w:pos="2160"/>
+        </w:tabs>
+        <w:ind w:left="2160" w:hanging="360"/>
+      </w:pPr>
+      <w:rPr>
+        <w:rFonts w:ascii="Wingdings" w:hAnsi="Wingdings" w:hint="default"/>
+        <w:sz w:val="20"/>
+      </w:rPr>
+    </w:lvl>
+    <w:lvl w:ilvl="3" w:tentative="1">
+      <w:start w:val="1"/>
+      <w:numFmt w:val="bullet"/>
+      <w:lvlText w:val=""/>
+      <w:lvlJc w:val="left"/>
+      <w:pPr>
+        <w:tabs>
+          <w:tab w:val="num" w:pos="2880"/>
+        </w:tabs>
+        <w:ind w:left="2880" w:hanging="360"/>
+      </w:pPr>
+      <w:rPr>
+        <w:rFonts w:ascii="Wingdings" w:hAnsi="Wingdings" w:hint="default"/>
+        <w:sz w:val="20"/>
+      </w:rPr>
+    </w:lvl>
+    <w:lvl w:ilvl="4" w:tentative="1">
+      <w:start w:val="1"/>
+      <w:numFmt w:val="bullet"/>
+      <w:lvlText w:val=""/>
+      <w:lvlJc w:val="left"/>
+      <w:pPr>
+        <w:tabs>
+          <w:tab w:val="num" w:pos="3600"/>
+        </w:tabs>
+        <w:ind w:left="3600" w:hanging="360"/>
+      </w:pPr>
+      <w:rPr>
+        <w:rFonts w:ascii="Wingdings" w:hAnsi="Wingdings" w:hint="default"/>
+        <w:sz w:val="20"/>
+      </w:rPr>
+    </w:lvl>
+    <w:lvl w:ilvl="5" w:tentative="1">
+      <w:start w:val="1"/>
+      <w:numFmt w:val="bullet"/>
+      <w:lvlText w:val=""/>
+      <w:lvlJc w:val="left"/>
+      <w:pPr>
+        <w:tabs>
+          <w:tab w:val="num" w:pos="4320"/>
+        </w:tabs>
+        <w:ind w:left="4320" w:hanging="360"/>
+      </w:pPr>
+      <w:rPr>
+        <w:rFonts w:ascii="Wingdings" w:hAnsi="Wingdings" w:hint="default"/>
+        <w:sz w:val="20"/>
+      </w:rPr>
+    </w:lvl>
+    <w:lvl w:ilvl="6" w:tentative="1">
+      <w:start w:val="1"/>
+      <w:numFmt w:val="bullet"/>
+      <w:lvlText w:val=""/>
+      <w:lvlJc w:val="left"/>
+      <w:pPr>
+        <w:tabs>
+          <w:tab w:val="num" w:pos="5040"/>
+        </w:tabs>
+        <w:ind w:left="5040" w:hanging="360"/>
+      </w:pPr>
+      <w:rPr>
+        <w:rFonts w:ascii="Wingdings" w:hAnsi="Wingdings" w:hint="default"/>
+        <w:sz w:val="20"/>
+      </w:rPr>
+    </w:lvl>
+    <w:lvl w:ilvl="7" w:tentative="1">
+      <w:start w:val="1"/>
+      <w:numFmt w:val="bullet"/>
+      <w:lvlText w:val=""/>
+      <w:lvlJc w:val="left"/>
+      <w:pPr>
+        <w:tabs>
+          <w:tab w:val="num" w:pos="5760"/>
+        </w:tabs>
+        <w:ind w:left="5760" w:hanging="360"/>
+      </w:pPr>
+      <w:rPr>
+        <w:rFonts w:ascii="Wingdings" w:hAnsi="Wingdings" w:hint="default"/>
+        <w:sz w:val="20"/>
+      </w:rPr>
+    </w:lvl>
+    <w:lvl w:ilvl="8" w:tentative="1">
+      <w:start w:val="1"/>
+      <w:numFmt w:val="bullet"/>
+      <w:lvlText w:val=""/>
+      <w:lvlJc w:val="left"/>
+      <w:pPr>
+        <w:tabs>
+          <w:tab w:val="num" w:pos="6480"/>
+        </w:tabs>
+        <w:ind w:left="6480" w:hanging="360"/>
+      </w:pPr>
+      <w:rPr>
+        <w:rFonts w:ascii="Wingdings" w:hAnsi="Wingdings" w:hint="default"/>
+        <w:sz w:val="20"/>
+      </w:rPr>
+    </w:lvl>
+  </w:abstractNum>
+  <w:abstractNum w:abstractNumId="2" w15:restartNumberingAfterBreak="0">
     <w:nsid w:val="059B45C8"/>
     <w:multiLevelType w:val="multilevel"/>
     <w:tmpl w:val="8D8CE0C6"/>
@@ -3403,7 +4180,7 @@
       </w:rPr>
     </w:lvl>
   </w:abstractNum>
-  <w:abstractNum w:abstractNumId="2" w15:restartNumberingAfterBreak="0">
+  <w:abstractNum w:abstractNumId="3" w15:restartNumberingAfterBreak="0">
     <w:nsid w:val="06DA00C5"/>
     <w:multiLevelType w:val="multilevel"/>
     <w:tmpl w:val="6A14DFDE"/>
@@ -3552,7 +4329,7 @@
       </w:rPr>
     </w:lvl>
   </w:abstractNum>
-  <w:abstractNum w:abstractNumId="3" w15:restartNumberingAfterBreak="0">
+  <w:abstractNum w:abstractNumId="4" w15:restartNumberingAfterBreak="0">
     <w:nsid w:val="07C0738A"/>
     <w:multiLevelType w:val="multilevel"/>
     <w:tmpl w:val="81D43F94"/>
@@ -3701,7 +4478,156 @@
       </w:rPr>
     </w:lvl>
   </w:abstractNum>
-  <w:abstractNum w:abstractNumId="4" w15:restartNumberingAfterBreak="0">
+  <w:abstractNum w:abstractNumId="5" w15:restartNumberingAfterBreak="0">
+    <w:nsid w:val="08316181"/>
+    <w:multiLevelType w:val="multilevel"/>
+    <w:tmpl w:val="C110F5EE"/>
+    <w:lvl w:ilvl="0">
+      <w:start w:val="1"/>
+      <w:numFmt w:val="bullet"/>
+      <w:lvlText w:val=""/>
+      <w:lvlJc w:val="left"/>
+      <w:pPr>
+        <w:tabs>
+          <w:tab w:val="num" w:pos="720"/>
+        </w:tabs>
+        <w:ind w:left="720" w:hanging="360"/>
+      </w:pPr>
+      <w:rPr>
+        <w:rFonts w:ascii="Symbol" w:hAnsi="Symbol" w:hint="default"/>
+        <w:sz w:val="20"/>
+      </w:rPr>
+    </w:lvl>
+    <w:lvl w:ilvl="1" w:tentative="1">
+      <w:start w:val="1"/>
+      <w:numFmt w:val="bullet"/>
+      <w:lvlText w:val="o"/>
+      <w:lvlJc w:val="left"/>
+      <w:pPr>
+        <w:tabs>
+          <w:tab w:val="num" w:pos="1440"/>
+        </w:tabs>
+        <w:ind w:left="1440" w:hanging="360"/>
+      </w:pPr>
+      <w:rPr>
+        <w:rFonts w:ascii="Courier New" w:hAnsi="Courier New" w:hint="default"/>
+        <w:sz w:val="20"/>
+      </w:rPr>
+    </w:lvl>
+    <w:lvl w:ilvl="2" w:tentative="1">
+      <w:start w:val="1"/>
+      <w:numFmt w:val="bullet"/>
+      <w:lvlText w:val=""/>
+      <w:lvlJc w:val="left"/>
+      <w:pPr>
+        <w:tabs>
+          <w:tab w:val="num" w:pos="2160"/>
+        </w:tabs>
+        <w:ind w:left="2160" w:hanging="360"/>
+      </w:pPr>
+      <w:rPr>
+        <w:rFonts w:ascii="Wingdings" w:hAnsi="Wingdings" w:hint="default"/>
+        <w:sz w:val="20"/>
+      </w:rPr>
+    </w:lvl>
+    <w:lvl w:ilvl="3" w:tentative="1">
+      <w:start w:val="1"/>
+      <w:numFmt w:val="bullet"/>
+      <w:lvlText w:val=""/>
+      <w:lvlJc w:val="left"/>
+      <w:pPr>
+        <w:tabs>
+          <w:tab w:val="num" w:pos="2880"/>
+        </w:tabs>
+        <w:ind w:left="2880" w:hanging="360"/>
+      </w:pPr>
+      <w:rPr>
+        <w:rFonts w:ascii="Wingdings" w:hAnsi="Wingdings" w:hint="default"/>
+        <w:sz w:val="20"/>
+      </w:rPr>
+    </w:lvl>
+    <w:lvl w:ilvl="4" w:tentative="1">
+      <w:start w:val="1"/>
+      <w:numFmt w:val="bullet"/>
+      <w:lvlText w:val=""/>
+      <w:lvlJc w:val="left"/>
+      <w:pPr>
+        <w:tabs>
+          <w:tab w:val="num" w:pos="3600"/>
+        </w:tabs>
+        <w:ind w:left="3600" w:hanging="360"/>
+      </w:pPr>
+      <w:rPr>
+        <w:rFonts w:ascii="Wingdings" w:hAnsi="Wingdings" w:hint="default"/>
+        <w:sz w:val="20"/>
+      </w:rPr>
+    </w:lvl>
+    <w:lvl w:ilvl="5" w:tentative="1">
+      <w:start w:val="1"/>
+      <w:numFmt w:val="bullet"/>
+      <w:lvlText w:val=""/>
+      <w:lvlJc w:val="left"/>
+      <w:pPr>
+        <w:tabs>
+          <w:tab w:val="num" w:pos="4320"/>
+        </w:tabs>
+        <w:ind w:left="4320" w:hanging="360"/>
+      </w:pPr>
+      <w:rPr>
+        <w:rFonts w:ascii="Wingdings" w:hAnsi="Wingdings" w:hint="default"/>
+        <w:sz w:val="20"/>
+      </w:rPr>
+    </w:lvl>
+    <w:lvl w:ilvl="6" w:tentative="1">
+      <w:start w:val="1"/>
+      <w:numFmt w:val="bullet"/>
+      <w:lvlText w:val=""/>
+      <w:lvlJc w:val="left"/>
+      <w:pPr>
+        <w:tabs>
+          <w:tab w:val="num" w:pos="5040"/>
+        </w:tabs>
+        <w:ind w:left="5040" w:hanging="360"/>
+      </w:pPr>
+      <w:rPr>
+        <w:rFonts w:ascii="Wingdings" w:hAnsi="Wingdings" w:hint="default"/>
+        <w:sz w:val="20"/>
+      </w:rPr>
+    </w:lvl>
+    <w:lvl w:ilvl="7" w:tentative="1">
+      <w:start w:val="1"/>
+      <w:numFmt w:val="bullet"/>
+      <w:lvlText w:val=""/>
+      <w:lvlJc w:val="left"/>
+      <w:pPr>
+        <w:tabs>
+          <w:tab w:val="num" w:pos="5760"/>
+        </w:tabs>
+        <w:ind w:left="5760" w:hanging="360"/>
+      </w:pPr>
+      <w:rPr>
+        <w:rFonts w:ascii="Wingdings" w:hAnsi="Wingdings" w:hint="default"/>
+        <w:sz w:val="20"/>
+      </w:rPr>
+    </w:lvl>
+    <w:lvl w:ilvl="8" w:tentative="1">
+      <w:start w:val="1"/>
+      <w:numFmt w:val="bullet"/>
+      <w:lvlText w:val=""/>
+      <w:lvlJc w:val="left"/>
+      <w:pPr>
+        <w:tabs>
+          <w:tab w:val="num" w:pos="6480"/>
+        </w:tabs>
+        <w:ind w:left="6480" w:hanging="360"/>
+      </w:pPr>
+      <w:rPr>
+        <w:rFonts w:ascii="Wingdings" w:hAnsi="Wingdings" w:hint="default"/>
+        <w:sz w:val="20"/>
+      </w:rPr>
+    </w:lvl>
+  </w:abstractNum>
+  <w:abstractNum w:abstractNumId="6" w15:restartNumberingAfterBreak="0">
     <w:nsid w:val="093265A4"/>
     <w:multiLevelType w:val="multilevel"/>
     <w:tmpl w:val="088AFA0C"/>
@@ -3850,7 +4776,7 @@
       </w:rPr>
     </w:lvl>
   </w:abstractNum>
-  <w:abstractNum w:abstractNumId="5" w15:restartNumberingAfterBreak="0">
+  <w:abstractNum w:abstractNumId="7" w15:restartNumberingAfterBreak="0">
     <w:nsid w:val="0A396F2A"/>
     <w:multiLevelType w:val="multilevel"/>
     <w:tmpl w:val="CABC3A86"/>
@@ -3999,7 +4925,7 @@
       </w:rPr>
     </w:lvl>
   </w:abstractNum>
-  <w:abstractNum w:abstractNumId="6" w15:restartNumberingAfterBreak="0">
+  <w:abstractNum w:abstractNumId="8" w15:restartNumberingAfterBreak="0">
     <w:nsid w:val="0D3B3292"/>
     <w:multiLevelType w:val="multilevel"/>
     <w:tmpl w:val="7618DA08"/>
@@ -4148,7 +5074,7 @@
       </w:rPr>
     </w:lvl>
   </w:abstractNum>
-  <w:abstractNum w:abstractNumId="7" w15:restartNumberingAfterBreak="0">
+  <w:abstractNum w:abstractNumId="9" w15:restartNumberingAfterBreak="0">
     <w:nsid w:val="0F090940"/>
     <w:multiLevelType w:val="multilevel"/>
     <w:tmpl w:val="4062748C"/>
@@ -4297,7 +5223,7 @@
       </w:rPr>
     </w:lvl>
   </w:abstractNum>
-  <w:abstractNum w:abstractNumId="8" w15:restartNumberingAfterBreak="0">
+  <w:abstractNum w:abstractNumId="10" w15:restartNumberingAfterBreak="0">
     <w:nsid w:val="0FDF0F2B"/>
     <w:multiLevelType w:val="multilevel"/>
     <w:tmpl w:val="3982A18A"/>
@@ -4446,7 +5372,156 @@
       </w:rPr>
     </w:lvl>
   </w:abstractNum>
-  <w:abstractNum w:abstractNumId="9" w15:restartNumberingAfterBreak="0">
+  <w:abstractNum w:abstractNumId="11" w15:restartNumberingAfterBreak="0">
+    <w:nsid w:val="128A7C2F"/>
+    <w:multiLevelType w:val="multilevel"/>
+    <w:tmpl w:val="E6526EEE"/>
+    <w:lvl w:ilvl="0">
+      <w:start w:val="1"/>
+      <w:numFmt w:val="bullet"/>
+      <w:lvlText w:val=""/>
+      <w:lvlJc w:val="left"/>
+      <w:pPr>
+        <w:tabs>
+          <w:tab w:val="num" w:pos="720"/>
+        </w:tabs>
+        <w:ind w:left="720" w:hanging="360"/>
+      </w:pPr>
+      <w:rPr>
+        <w:rFonts w:ascii="Symbol" w:hAnsi="Symbol" w:hint="default"/>
+        <w:sz w:val="20"/>
+      </w:rPr>
+    </w:lvl>
+    <w:lvl w:ilvl="1" w:tentative="1">
+      <w:start w:val="1"/>
+      <w:numFmt w:val="bullet"/>
+      <w:lvlText w:val="o"/>
+      <w:lvlJc w:val="left"/>
+      <w:pPr>
+        <w:tabs>
+          <w:tab w:val="num" w:pos="1440"/>
+        </w:tabs>
+        <w:ind w:left="1440" w:hanging="360"/>
+      </w:pPr>
+      <w:rPr>
+        <w:rFonts w:ascii="Courier New" w:hAnsi="Courier New" w:hint="default"/>
+        <w:sz w:val="20"/>
+      </w:rPr>
+    </w:lvl>
+    <w:lvl w:ilvl="2" w:tentative="1">
+      <w:start w:val="1"/>
+      <w:numFmt w:val="bullet"/>
+      <w:lvlText w:val=""/>
+      <w:lvlJc w:val="left"/>
+      <w:pPr>
+        <w:tabs>
+          <w:tab w:val="num" w:pos="2160"/>
+        </w:tabs>
+        <w:ind w:left="2160" w:hanging="360"/>
+      </w:pPr>
+      <w:rPr>
+        <w:rFonts w:ascii="Wingdings" w:hAnsi="Wingdings" w:hint="default"/>
+        <w:sz w:val="20"/>
+      </w:rPr>
+    </w:lvl>
+    <w:lvl w:ilvl="3" w:tentative="1">
+      <w:start w:val="1"/>
+      <w:numFmt w:val="bullet"/>
+      <w:lvlText w:val=""/>
+      <w:lvlJc w:val="left"/>
+      <w:pPr>
+        <w:tabs>
+          <w:tab w:val="num" w:pos="2880"/>
+        </w:tabs>
+        <w:ind w:left="2880" w:hanging="360"/>
+      </w:pPr>
+      <w:rPr>
+        <w:rFonts w:ascii="Wingdings" w:hAnsi="Wingdings" w:hint="default"/>
+        <w:sz w:val="20"/>
+      </w:rPr>
+    </w:lvl>
+    <w:lvl w:ilvl="4" w:tentative="1">
+      <w:start w:val="1"/>
+      <w:numFmt w:val="bullet"/>
+      <w:lvlText w:val=""/>
+      <w:lvlJc w:val="left"/>
+      <w:pPr>
+        <w:tabs>
+          <w:tab w:val="num" w:pos="3600"/>
+        </w:tabs>
+        <w:ind w:left="3600" w:hanging="360"/>
+      </w:pPr>
+      <w:rPr>
+        <w:rFonts w:ascii="Wingdings" w:hAnsi="Wingdings" w:hint="default"/>
+        <w:sz w:val="20"/>
+      </w:rPr>
+    </w:lvl>
+    <w:lvl w:ilvl="5" w:tentative="1">
+      <w:start w:val="1"/>
+      <w:numFmt w:val="bullet"/>
+      <w:lvlText w:val=""/>
+      <w:lvlJc w:val="left"/>
+      <w:pPr>
+        <w:tabs>
+          <w:tab w:val="num" w:pos="4320"/>
+        </w:tabs>
+        <w:ind w:left="4320" w:hanging="360"/>
+      </w:pPr>
+      <w:rPr>
+        <w:rFonts w:ascii="Wingdings" w:hAnsi="Wingdings" w:hint="default"/>
+        <w:sz w:val="20"/>
+      </w:rPr>
+    </w:lvl>
+    <w:lvl w:ilvl="6" w:tentative="1">
+      <w:start w:val="1"/>
+      <w:numFmt w:val="bullet"/>
+      <w:lvlText w:val=""/>
+      <w:lvlJc w:val="left"/>
+      <w:pPr>
+        <w:tabs>
+          <w:tab w:val="num" w:pos="5040"/>
+        </w:tabs>
+        <w:ind w:left="5040" w:hanging="360"/>
+      </w:pPr>
+      <w:rPr>
+        <w:rFonts w:ascii="Wingdings" w:hAnsi="Wingdings" w:hint="default"/>
+        <w:sz w:val="20"/>
+      </w:rPr>
+    </w:lvl>
+    <w:lvl w:ilvl="7" w:tentative="1">
+      <w:start w:val="1"/>
+      <w:numFmt w:val="bullet"/>
+      <w:lvlText w:val=""/>
+      <w:lvlJc w:val="left"/>
+      <w:pPr>
+        <w:tabs>
+          <w:tab w:val="num" w:pos="5760"/>
+        </w:tabs>
+        <w:ind w:left="5760" w:hanging="360"/>
+      </w:pPr>
+      <w:rPr>
+        <w:rFonts w:ascii="Wingdings" w:hAnsi="Wingdings" w:hint="default"/>
+        <w:sz w:val="20"/>
+      </w:rPr>
+    </w:lvl>
+    <w:lvl w:ilvl="8" w:tentative="1">
+      <w:start w:val="1"/>
+      <w:numFmt w:val="bullet"/>
+      <w:lvlText w:val=""/>
+      <w:lvlJc w:val="left"/>
+      <w:pPr>
+        <w:tabs>
+          <w:tab w:val="num" w:pos="6480"/>
+        </w:tabs>
+        <w:ind w:left="6480" w:hanging="360"/>
+      </w:pPr>
+      <w:rPr>
+        <w:rFonts w:ascii="Wingdings" w:hAnsi="Wingdings" w:hint="default"/>
+        <w:sz w:val="20"/>
+      </w:rPr>
+    </w:lvl>
+  </w:abstractNum>
+  <w:abstractNum w:abstractNumId="12" w15:restartNumberingAfterBreak="0">
     <w:nsid w:val="15BC1106"/>
     <w:multiLevelType w:val="multilevel"/>
     <w:tmpl w:val="A446ADCC"/>
@@ -4595,7 +5670,7 @@
       </w:rPr>
     </w:lvl>
   </w:abstractNum>
-  <w:abstractNum w:abstractNumId="10" w15:restartNumberingAfterBreak="0">
+  <w:abstractNum w:abstractNumId="13" w15:restartNumberingAfterBreak="0">
     <w:nsid w:val="18CD3117"/>
     <w:multiLevelType w:val="multilevel"/>
     <w:tmpl w:val="D63EAEEA"/>
@@ -4744,7 +5819,7 @@
       </w:rPr>
     </w:lvl>
   </w:abstractNum>
-  <w:abstractNum w:abstractNumId="11" w15:restartNumberingAfterBreak="0">
+  <w:abstractNum w:abstractNumId="14" w15:restartNumberingAfterBreak="0">
     <w:nsid w:val="1954606F"/>
     <w:multiLevelType w:val="multilevel"/>
     <w:tmpl w:val="992808C8"/>
@@ -4893,7 +5968,7 @@
       </w:rPr>
     </w:lvl>
   </w:abstractNum>
-  <w:abstractNum w:abstractNumId="12" w15:restartNumberingAfterBreak="0">
+  <w:abstractNum w:abstractNumId="15" w15:restartNumberingAfterBreak="0">
     <w:nsid w:val="1C3C6E43"/>
     <w:multiLevelType w:val="multilevel"/>
     <w:tmpl w:val="7B6C4960"/>
@@ -5042,7 +6117,7 @@
       </w:rPr>
     </w:lvl>
   </w:abstractNum>
-  <w:abstractNum w:abstractNumId="13" w15:restartNumberingAfterBreak="0">
+  <w:abstractNum w:abstractNumId="16" w15:restartNumberingAfterBreak="0">
     <w:nsid w:val="1EDC1CD7"/>
     <w:multiLevelType w:val="multilevel"/>
     <w:tmpl w:val="260ABDAA"/>
@@ -5191,7 +6266,7 @@
       </w:rPr>
     </w:lvl>
   </w:abstractNum>
-  <w:abstractNum w:abstractNumId="14" w15:restartNumberingAfterBreak="0">
+  <w:abstractNum w:abstractNumId="17" w15:restartNumberingAfterBreak="0">
     <w:nsid w:val="1F2E6385"/>
     <w:multiLevelType w:val="multilevel"/>
     <w:tmpl w:val="8294D708"/>
@@ -5340,7 +6415,7 @@
       </w:rPr>
     </w:lvl>
   </w:abstractNum>
-  <w:abstractNum w:abstractNumId="15" w15:restartNumberingAfterBreak="0">
+  <w:abstractNum w:abstractNumId="18" w15:restartNumberingAfterBreak="0">
     <w:nsid w:val="211D2043"/>
     <w:multiLevelType w:val="multilevel"/>
     <w:tmpl w:val="E4AC5C0A"/>
@@ -5489,7 +6564,7 @@
       </w:rPr>
     </w:lvl>
   </w:abstractNum>
-  <w:abstractNum w:abstractNumId="16" w15:restartNumberingAfterBreak="0">
+  <w:abstractNum w:abstractNumId="19" w15:restartNumberingAfterBreak="0">
     <w:nsid w:val="21FE3856"/>
     <w:multiLevelType w:val="multilevel"/>
     <w:tmpl w:val="F2EE2E56"/>
@@ -5638,7 +6713,7 @@
       </w:rPr>
     </w:lvl>
   </w:abstractNum>
-  <w:abstractNum w:abstractNumId="17" w15:restartNumberingAfterBreak="0">
+  <w:abstractNum w:abstractNumId="20" w15:restartNumberingAfterBreak="0">
     <w:nsid w:val="230821DF"/>
     <w:multiLevelType w:val="multilevel"/>
     <w:tmpl w:val="4E9C1632"/>
@@ -5787,7 +6862,156 @@
       </w:rPr>
     </w:lvl>
   </w:abstractNum>
-  <w:abstractNum w:abstractNumId="18" w15:restartNumberingAfterBreak="0">
+  <w:abstractNum w:abstractNumId="21" w15:restartNumberingAfterBreak="0">
+    <w:nsid w:val="23384C53"/>
+    <w:multiLevelType w:val="multilevel"/>
+    <w:tmpl w:val="7FF2EA8C"/>
+    <w:lvl w:ilvl="0">
+      <w:start w:val="1"/>
+      <w:numFmt w:val="bullet"/>
+      <w:lvlText w:val=""/>
+      <w:lvlJc w:val="left"/>
+      <w:pPr>
+        <w:tabs>
+          <w:tab w:val="num" w:pos="720"/>
+        </w:tabs>
+        <w:ind w:left="720" w:hanging="360"/>
+      </w:pPr>
+      <w:rPr>
+        <w:rFonts w:ascii="Symbol" w:hAnsi="Symbol" w:hint="default"/>
+        <w:sz w:val="20"/>
+      </w:rPr>
+    </w:lvl>
+    <w:lvl w:ilvl="1" w:tentative="1">
+      <w:start w:val="1"/>
+      <w:numFmt w:val="bullet"/>
+      <w:lvlText w:val="o"/>
+      <w:lvlJc w:val="left"/>
+      <w:pPr>
+        <w:tabs>
+          <w:tab w:val="num" w:pos="1440"/>
+        </w:tabs>
+        <w:ind w:left="1440" w:hanging="360"/>
+      </w:pPr>
+      <w:rPr>
+        <w:rFonts w:ascii="Courier New" w:hAnsi="Courier New" w:hint="default"/>
+        <w:sz w:val="20"/>
+      </w:rPr>
+    </w:lvl>
+    <w:lvl w:ilvl="2" w:tentative="1">
+      <w:start w:val="1"/>
+      <w:numFmt w:val="bullet"/>
+      <w:lvlText w:val=""/>
+      <w:lvlJc w:val="left"/>
+      <w:pPr>
+        <w:tabs>
+          <w:tab w:val="num" w:pos="2160"/>
+        </w:tabs>
+        <w:ind w:left="2160" w:hanging="360"/>
+      </w:pPr>
+      <w:rPr>
+        <w:rFonts w:ascii="Wingdings" w:hAnsi="Wingdings" w:hint="default"/>
+        <w:sz w:val="20"/>
+      </w:rPr>
+    </w:lvl>
+    <w:lvl w:ilvl="3" w:tentative="1">
+      <w:start w:val="1"/>
+      <w:numFmt w:val="bullet"/>
+      <w:lvlText w:val=""/>
+      <w:lvlJc w:val="left"/>
+      <w:pPr>
+        <w:tabs>
+          <w:tab w:val="num" w:pos="2880"/>
+        </w:tabs>
+        <w:ind w:left="2880" w:hanging="360"/>
+      </w:pPr>
+      <w:rPr>
+        <w:rFonts w:ascii="Wingdings" w:hAnsi="Wingdings" w:hint="default"/>
+        <w:sz w:val="20"/>
+      </w:rPr>
+    </w:lvl>
+    <w:lvl w:ilvl="4" w:tentative="1">
+      <w:start w:val="1"/>
+      <w:numFmt w:val="bullet"/>
+      <w:lvlText w:val=""/>
+      <w:lvlJc w:val="left"/>
+      <w:pPr>
+        <w:tabs>
+          <w:tab w:val="num" w:pos="3600"/>
+        </w:tabs>
+        <w:ind w:left="3600" w:hanging="360"/>
+      </w:pPr>
+      <w:rPr>
+        <w:rFonts w:ascii="Wingdings" w:hAnsi="Wingdings" w:hint="default"/>
+        <w:sz w:val="20"/>
+      </w:rPr>
+    </w:lvl>
+    <w:lvl w:ilvl="5" w:tentative="1">
+      <w:start w:val="1"/>
+      <w:numFmt w:val="bullet"/>
+      <w:lvlText w:val=""/>
+      <w:lvlJc w:val="left"/>
+      <w:pPr>
+        <w:tabs>
+          <w:tab w:val="num" w:pos="4320"/>
+        </w:tabs>
+        <w:ind w:left="4320" w:hanging="360"/>
+      </w:pPr>
+      <w:rPr>
+        <w:rFonts w:ascii="Wingdings" w:hAnsi="Wingdings" w:hint="default"/>
+        <w:sz w:val="20"/>
+      </w:rPr>
+    </w:lvl>
+    <w:lvl w:ilvl="6" w:tentative="1">
+      <w:start w:val="1"/>
+      <w:numFmt w:val="bullet"/>
+      <w:lvlText w:val=""/>
+      <w:lvlJc w:val="left"/>
+      <w:pPr>
+        <w:tabs>
+          <w:tab w:val="num" w:pos="5040"/>
+        </w:tabs>
+        <w:ind w:left="5040" w:hanging="360"/>
+      </w:pPr>
+      <w:rPr>
+        <w:rFonts w:ascii="Wingdings" w:hAnsi="Wingdings" w:hint="default"/>
+        <w:sz w:val="20"/>
+      </w:rPr>
+    </w:lvl>
+    <w:lvl w:ilvl="7" w:tentative="1">
+      <w:start w:val="1"/>
+      <w:numFmt w:val="bullet"/>
+      <w:lvlText w:val=""/>
+      <w:lvlJc w:val="left"/>
+      <w:pPr>
+        <w:tabs>
+          <w:tab w:val="num" w:pos="5760"/>
+        </w:tabs>
+        <w:ind w:left="5760" w:hanging="360"/>
+      </w:pPr>
+      <w:rPr>
+        <w:rFonts w:ascii="Wingdings" w:hAnsi="Wingdings" w:hint="default"/>
+        <w:sz w:val="20"/>
+      </w:rPr>
+    </w:lvl>
+    <w:lvl w:ilvl="8" w:tentative="1">
+      <w:start w:val="1"/>
+      <w:numFmt w:val="bullet"/>
+      <w:lvlText w:val=""/>
+      <w:lvlJc w:val="left"/>
+      <w:pPr>
+        <w:tabs>
+          <w:tab w:val="num" w:pos="6480"/>
+        </w:tabs>
+        <w:ind w:left="6480" w:hanging="360"/>
+      </w:pPr>
+      <w:rPr>
+        <w:rFonts w:ascii="Wingdings" w:hAnsi="Wingdings" w:hint="default"/>
+        <w:sz w:val="20"/>
+      </w:rPr>
+    </w:lvl>
+  </w:abstractNum>
+  <w:abstractNum w:abstractNumId="22" w15:restartNumberingAfterBreak="0">
     <w:nsid w:val="24133470"/>
     <w:multiLevelType w:val="multilevel"/>
     <w:tmpl w:val="B98CDB76"/>
@@ -5936,7 +7160,7 @@
       </w:rPr>
     </w:lvl>
   </w:abstractNum>
-  <w:abstractNum w:abstractNumId="19" w15:restartNumberingAfterBreak="0">
+  <w:abstractNum w:abstractNumId="23" w15:restartNumberingAfterBreak="0">
     <w:nsid w:val="25C7062C"/>
     <w:multiLevelType w:val="multilevel"/>
     <w:tmpl w:val="EE38966A"/>
@@ -6085,7 +7309,7 @@
       </w:rPr>
     </w:lvl>
   </w:abstractNum>
-  <w:abstractNum w:abstractNumId="20" w15:restartNumberingAfterBreak="0">
+  <w:abstractNum w:abstractNumId="24" w15:restartNumberingAfterBreak="0">
     <w:nsid w:val="271C117C"/>
     <w:multiLevelType w:val="multilevel"/>
     <w:tmpl w:val="E45888EE"/>
@@ -6234,7 +7458,7 @@
       </w:rPr>
     </w:lvl>
   </w:abstractNum>
-  <w:abstractNum w:abstractNumId="21" w15:restartNumberingAfterBreak="0">
+  <w:abstractNum w:abstractNumId="25" w15:restartNumberingAfterBreak="0">
     <w:nsid w:val="28882EA1"/>
     <w:multiLevelType w:val="multilevel"/>
     <w:tmpl w:val="34FAEB0E"/>
@@ -6383,7 +7607,156 @@
       </w:rPr>
     </w:lvl>
   </w:abstractNum>
-  <w:abstractNum w:abstractNumId="22" w15:restartNumberingAfterBreak="0">
+  <w:abstractNum w:abstractNumId="26" w15:restartNumberingAfterBreak="0">
+    <w:nsid w:val="28FA2801"/>
+    <w:multiLevelType w:val="multilevel"/>
+    <w:tmpl w:val="D03AF06A"/>
+    <w:lvl w:ilvl="0">
+      <w:start w:val="1"/>
+      <w:numFmt w:val="bullet"/>
+      <w:lvlText w:val=""/>
+      <w:lvlJc w:val="left"/>
+      <w:pPr>
+        <w:tabs>
+          <w:tab w:val="num" w:pos="720"/>
+        </w:tabs>
+        <w:ind w:left="720" w:hanging="360"/>
+      </w:pPr>
+      <w:rPr>
+        <w:rFonts w:ascii="Symbol" w:hAnsi="Symbol" w:hint="default"/>
+        <w:sz w:val="20"/>
+      </w:rPr>
+    </w:lvl>
+    <w:lvl w:ilvl="1" w:tentative="1">
+      <w:start w:val="1"/>
+      <w:numFmt w:val="bullet"/>
+      <w:lvlText w:val="o"/>
+      <w:lvlJc w:val="left"/>
+      <w:pPr>
+        <w:tabs>
+          <w:tab w:val="num" w:pos="1440"/>
+        </w:tabs>
+        <w:ind w:left="1440" w:hanging="360"/>
+      </w:pPr>
+      <w:rPr>
+        <w:rFonts w:ascii="Courier New" w:hAnsi="Courier New" w:hint="default"/>
+        <w:sz w:val="20"/>
+      </w:rPr>
+    </w:lvl>
+    <w:lvl w:ilvl="2" w:tentative="1">
+      <w:start w:val="1"/>
+      <w:numFmt w:val="bullet"/>
+      <w:lvlText w:val=""/>
+      <w:lvlJc w:val="left"/>
+      <w:pPr>
+        <w:tabs>
+          <w:tab w:val="num" w:pos="2160"/>
+        </w:tabs>
+        <w:ind w:left="2160" w:hanging="360"/>
+      </w:pPr>
+      <w:rPr>
+        <w:rFonts w:ascii="Wingdings" w:hAnsi="Wingdings" w:hint="default"/>
+        <w:sz w:val="20"/>
+      </w:rPr>
+    </w:lvl>
+    <w:lvl w:ilvl="3" w:tentative="1">
+      <w:start w:val="1"/>
+      <w:numFmt w:val="bullet"/>
+      <w:lvlText w:val=""/>
+      <w:lvlJc w:val="left"/>
+      <w:pPr>
+        <w:tabs>
+          <w:tab w:val="num" w:pos="2880"/>
+        </w:tabs>
+        <w:ind w:left="2880" w:hanging="360"/>
+      </w:pPr>
+      <w:rPr>
+        <w:rFonts w:ascii="Wingdings" w:hAnsi="Wingdings" w:hint="default"/>
+        <w:sz w:val="20"/>
+      </w:rPr>
+    </w:lvl>
+    <w:lvl w:ilvl="4" w:tentative="1">
+      <w:start w:val="1"/>
+      <w:numFmt w:val="bullet"/>
+      <w:lvlText w:val=""/>
+      <w:lvlJc w:val="left"/>
+      <w:pPr>
+        <w:tabs>
+          <w:tab w:val="num" w:pos="3600"/>
+        </w:tabs>
+        <w:ind w:left="3600" w:hanging="360"/>
+      </w:pPr>
+      <w:rPr>
+        <w:rFonts w:ascii="Wingdings" w:hAnsi="Wingdings" w:hint="default"/>
+        <w:sz w:val="20"/>
+      </w:rPr>
+    </w:lvl>
+    <w:lvl w:ilvl="5" w:tentative="1">
+      <w:start w:val="1"/>
+      <w:numFmt w:val="bullet"/>
+      <w:lvlText w:val=""/>
+      <w:lvlJc w:val="left"/>
+      <w:pPr>
+        <w:tabs>
+          <w:tab w:val="num" w:pos="4320"/>
+        </w:tabs>
+        <w:ind w:left="4320" w:hanging="360"/>
+      </w:pPr>
+      <w:rPr>
+        <w:rFonts w:ascii="Wingdings" w:hAnsi="Wingdings" w:hint="default"/>
+        <w:sz w:val="20"/>
+      </w:rPr>
+    </w:lvl>
+    <w:lvl w:ilvl="6" w:tentative="1">
+      <w:start w:val="1"/>
+      <w:numFmt w:val="bullet"/>
+      <w:lvlText w:val=""/>
+      <w:lvlJc w:val="left"/>
+      <w:pPr>
+        <w:tabs>
+          <w:tab w:val="num" w:pos="5040"/>
+        </w:tabs>
+        <w:ind w:left="5040" w:hanging="360"/>
+      </w:pPr>
+      <w:rPr>
+        <w:rFonts w:ascii="Wingdings" w:hAnsi="Wingdings" w:hint="default"/>
+        <w:sz w:val="20"/>
+      </w:rPr>
+    </w:lvl>
+    <w:lvl w:ilvl="7" w:tentative="1">
+      <w:start w:val="1"/>
+      <w:numFmt w:val="bullet"/>
+      <w:lvlText w:val=""/>
+      <w:lvlJc w:val="left"/>
+      <w:pPr>
+        <w:tabs>
+          <w:tab w:val="num" w:pos="5760"/>
+        </w:tabs>
+        <w:ind w:left="5760" w:hanging="360"/>
+      </w:pPr>
+      <w:rPr>
+        <w:rFonts w:ascii="Wingdings" w:hAnsi="Wingdings" w:hint="default"/>
+        <w:sz w:val="20"/>
+      </w:rPr>
+    </w:lvl>
+    <w:lvl w:ilvl="8" w:tentative="1">
+      <w:start w:val="1"/>
+      <w:numFmt w:val="bullet"/>
+      <w:lvlText w:val=""/>
+      <w:lvlJc w:val="left"/>
+      <w:pPr>
+        <w:tabs>
+          <w:tab w:val="num" w:pos="6480"/>
+        </w:tabs>
+        <w:ind w:left="6480" w:hanging="360"/>
+      </w:pPr>
+      <w:rPr>
+        <w:rFonts w:ascii="Wingdings" w:hAnsi="Wingdings" w:hint="default"/>
+        <w:sz w:val="20"/>
+      </w:rPr>
+    </w:lvl>
+  </w:abstractNum>
+  <w:abstractNum w:abstractNumId="27" w15:restartNumberingAfterBreak="0">
     <w:nsid w:val="29B94D0A"/>
     <w:multiLevelType w:val="multilevel"/>
     <w:tmpl w:val="A22C22A2"/>
@@ -6532,7 +7905,7 @@
       </w:rPr>
     </w:lvl>
   </w:abstractNum>
-  <w:abstractNum w:abstractNumId="23" w15:restartNumberingAfterBreak="0">
+  <w:abstractNum w:abstractNumId="28" w15:restartNumberingAfterBreak="0">
     <w:nsid w:val="29EE483B"/>
     <w:multiLevelType w:val="multilevel"/>
     <w:tmpl w:val="902A204A"/>
@@ -6681,7 +8054,7 @@
       </w:rPr>
     </w:lvl>
   </w:abstractNum>
-  <w:abstractNum w:abstractNumId="24" w15:restartNumberingAfterBreak="0">
+  <w:abstractNum w:abstractNumId="29" w15:restartNumberingAfterBreak="0">
     <w:nsid w:val="29FD19DB"/>
     <w:multiLevelType w:val="multilevel"/>
     <w:tmpl w:val="2E1A08C0"/>
@@ -6830,7 +8203,156 @@
       </w:rPr>
     </w:lvl>
   </w:abstractNum>
-  <w:abstractNum w:abstractNumId="25" w15:restartNumberingAfterBreak="0">
+  <w:abstractNum w:abstractNumId="30" w15:restartNumberingAfterBreak="0">
+    <w:nsid w:val="2AE30943"/>
+    <w:multiLevelType w:val="multilevel"/>
+    <w:tmpl w:val="F59ADAAA"/>
+    <w:lvl w:ilvl="0">
+      <w:start w:val="1"/>
+      <w:numFmt w:val="bullet"/>
+      <w:lvlText w:val=""/>
+      <w:lvlJc w:val="left"/>
+      <w:pPr>
+        <w:tabs>
+          <w:tab w:val="num" w:pos="720"/>
+        </w:tabs>
+        <w:ind w:left="720" w:hanging="360"/>
+      </w:pPr>
+      <w:rPr>
+        <w:rFonts w:ascii="Symbol" w:hAnsi="Symbol" w:hint="default"/>
+        <w:sz w:val="20"/>
+      </w:rPr>
+    </w:lvl>
+    <w:lvl w:ilvl="1" w:tentative="1">
+      <w:start w:val="1"/>
+      <w:numFmt w:val="bullet"/>
+      <w:lvlText w:val="o"/>
+      <w:lvlJc w:val="left"/>
+      <w:pPr>
+        <w:tabs>
+          <w:tab w:val="num" w:pos="1440"/>
+        </w:tabs>
+        <w:ind w:left="1440" w:hanging="360"/>
+      </w:pPr>
+      <w:rPr>
+        <w:rFonts w:ascii="Courier New" w:hAnsi="Courier New" w:hint="default"/>
+        <w:sz w:val="20"/>
+      </w:rPr>
+    </w:lvl>
+    <w:lvl w:ilvl="2" w:tentative="1">
+      <w:start w:val="1"/>
+      <w:numFmt w:val="bullet"/>
+      <w:lvlText w:val=""/>
+      <w:lvlJc w:val="left"/>
+      <w:pPr>
+        <w:tabs>
+          <w:tab w:val="num" w:pos="2160"/>
+        </w:tabs>
+        <w:ind w:left="2160" w:hanging="360"/>
+      </w:pPr>
+      <w:rPr>
+        <w:rFonts w:ascii="Wingdings" w:hAnsi="Wingdings" w:hint="default"/>
+        <w:sz w:val="20"/>
+      </w:rPr>
+    </w:lvl>
+    <w:lvl w:ilvl="3" w:tentative="1">
+      <w:start w:val="1"/>
+      <w:numFmt w:val="bullet"/>
+      <w:lvlText w:val=""/>
+      <w:lvlJc w:val="left"/>
+      <w:pPr>
+        <w:tabs>
+          <w:tab w:val="num" w:pos="2880"/>
+        </w:tabs>
+        <w:ind w:left="2880" w:hanging="360"/>
+      </w:pPr>
+      <w:rPr>
+        <w:rFonts w:ascii="Wingdings" w:hAnsi="Wingdings" w:hint="default"/>
+        <w:sz w:val="20"/>
+      </w:rPr>
+    </w:lvl>
+    <w:lvl w:ilvl="4" w:tentative="1">
+      <w:start w:val="1"/>
+      <w:numFmt w:val="bullet"/>
+      <w:lvlText w:val=""/>
+      <w:lvlJc w:val="left"/>
+      <w:pPr>
+        <w:tabs>
+          <w:tab w:val="num" w:pos="3600"/>
+        </w:tabs>
+        <w:ind w:left="3600" w:hanging="360"/>
+      </w:pPr>
+      <w:rPr>
+        <w:rFonts w:ascii="Wingdings" w:hAnsi="Wingdings" w:hint="default"/>
+        <w:sz w:val="20"/>
+      </w:rPr>
+    </w:lvl>
+    <w:lvl w:ilvl="5" w:tentative="1">
+      <w:start w:val="1"/>
+      <w:numFmt w:val="bullet"/>
+      <w:lvlText w:val=""/>
+      <w:lvlJc w:val="left"/>
+      <w:pPr>
+        <w:tabs>
+          <w:tab w:val="num" w:pos="4320"/>
+        </w:tabs>
+        <w:ind w:left="4320" w:hanging="360"/>
+      </w:pPr>
+      <w:rPr>
+        <w:rFonts w:ascii="Wingdings" w:hAnsi="Wingdings" w:hint="default"/>
+        <w:sz w:val="20"/>
+      </w:rPr>
+    </w:lvl>
+    <w:lvl w:ilvl="6" w:tentative="1">
+      <w:start w:val="1"/>
+      <w:numFmt w:val="bullet"/>
+      <w:lvlText w:val=""/>
+      <w:lvlJc w:val="left"/>
+      <w:pPr>
+        <w:tabs>
+          <w:tab w:val="num" w:pos="5040"/>
+        </w:tabs>
+        <w:ind w:left="5040" w:hanging="360"/>
+      </w:pPr>
+      <w:rPr>
+        <w:rFonts w:ascii="Wingdings" w:hAnsi="Wingdings" w:hint="default"/>
+        <w:sz w:val="20"/>
+      </w:rPr>
+    </w:lvl>
+    <w:lvl w:ilvl="7" w:tentative="1">
+      <w:start w:val="1"/>
+      <w:numFmt w:val="bullet"/>
+      <w:lvlText w:val=""/>
+      <w:lvlJc w:val="left"/>
+      <w:pPr>
+        <w:tabs>
+          <w:tab w:val="num" w:pos="5760"/>
+        </w:tabs>
+        <w:ind w:left="5760" w:hanging="360"/>
+      </w:pPr>
+      <w:rPr>
+        <w:rFonts w:ascii="Wingdings" w:hAnsi="Wingdings" w:hint="default"/>
+        <w:sz w:val="20"/>
+      </w:rPr>
+    </w:lvl>
+    <w:lvl w:ilvl="8" w:tentative="1">
+      <w:start w:val="1"/>
+      <w:numFmt w:val="bullet"/>
+      <w:lvlText w:val=""/>
+      <w:lvlJc w:val="left"/>
+      <w:pPr>
+        <w:tabs>
+          <w:tab w:val="num" w:pos="6480"/>
+        </w:tabs>
+        <w:ind w:left="6480" w:hanging="360"/>
+      </w:pPr>
+      <w:rPr>
+        <w:rFonts w:ascii="Wingdings" w:hAnsi="Wingdings" w:hint="default"/>
+        <w:sz w:val="20"/>
+      </w:rPr>
+    </w:lvl>
+  </w:abstractNum>
+  <w:abstractNum w:abstractNumId="31" w15:restartNumberingAfterBreak="0">
     <w:nsid w:val="2B035F6A"/>
     <w:multiLevelType w:val="multilevel"/>
     <w:tmpl w:val="859C3A10"/>
@@ -6979,7 +8501,7 @@
       </w:rPr>
     </w:lvl>
   </w:abstractNum>
-  <w:abstractNum w:abstractNumId="26" w15:restartNumberingAfterBreak="0">
+  <w:abstractNum w:abstractNumId="32" w15:restartNumberingAfterBreak="0">
     <w:nsid w:val="2B743E1B"/>
     <w:multiLevelType w:val="multilevel"/>
     <w:tmpl w:val="98B035FC"/>
@@ -7128,7 +8650,7 @@
       </w:rPr>
     </w:lvl>
   </w:abstractNum>
-  <w:abstractNum w:abstractNumId="27" w15:restartNumberingAfterBreak="0">
+  <w:abstractNum w:abstractNumId="33" w15:restartNumberingAfterBreak="0">
     <w:nsid w:val="2BD6668E"/>
     <w:multiLevelType w:val="multilevel"/>
     <w:tmpl w:val="3C7CABA2"/>
@@ -7277,7 +8799,7 @@
       </w:rPr>
     </w:lvl>
   </w:abstractNum>
-  <w:abstractNum w:abstractNumId="28" w15:restartNumberingAfterBreak="0">
+  <w:abstractNum w:abstractNumId="34" w15:restartNumberingAfterBreak="0">
     <w:nsid w:val="2C433BD2"/>
     <w:multiLevelType w:val="multilevel"/>
     <w:tmpl w:val="73CE2ADA"/>
@@ -7426,7 +8948,7 @@
       </w:rPr>
     </w:lvl>
   </w:abstractNum>
-  <w:abstractNum w:abstractNumId="29" w15:restartNumberingAfterBreak="0">
+  <w:abstractNum w:abstractNumId="35" w15:restartNumberingAfterBreak="0">
     <w:nsid w:val="2E287273"/>
     <w:multiLevelType w:val="multilevel"/>
     <w:tmpl w:val="FFA05CEC"/>
@@ -7575,7 +9097,305 @@
       </w:rPr>
     </w:lvl>
   </w:abstractNum>
-  <w:abstractNum w:abstractNumId="30" w15:restartNumberingAfterBreak="0">
+  <w:abstractNum w:abstractNumId="36" w15:restartNumberingAfterBreak="0">
+    <w:nsid w:val="2EE24415"/>
+    <w:multiLevelType w:val="multilevel"/>
+    <w:tmpl w:val="1AC8D9C4"/>
+    <w:lvl w:ilvl="0">
+      <w:start w:val="1"/>
+      <w:numFmt w:val="bullet"/>
+      <w:lvlText w:val=""/>
+      <w:lvlJc w:val="left"/>
+      <w:pPr>
+        <w:tabs>
+          <w:tab w:val="num" w:pos="720"/>
+        </w:tabs>
+        <w:ind w:left="720" w:hanging="360"/>
+      </w:pPr>
+      <w:rPr>
+        <w:rFonts w:ascii="Symbol" w:hAnsi="Symbol" w:hint="default"/>
+        <w:sz w:val="20"/>
+      </w:rPr>
+    </w:lvl>
+    <w:lvl w:ilvl="1" w:tentative="1">
+      <w:start w:val="1"/>
+      <w:numFmt w:val="bullet"/>
+      <w:lvlText w:val="o"/>
+      <w:lvlJc w:val="left"/>
+      <w:pPr>
+        <w:tabs>
+          <w:tab w:val="num" w:pos="1440"/>
+        </w:tabs>
+        <w:ind w:left="1440" w:hanging="360"/>
+      </w:pPr>
+      <w:rPr>
+        <w:rFonts w:ascii="Courier New" w:hAnsi="Courier New" w:hint="default"/>
+        <w:sz w:val="20"/>
+      </w:rPr>
+    </w:lvl>
+    <w:lvl w:ilvl="2" w:tentative="1">
+      <w:start w:val="1"/>
+      <w:numFmt w:val="bullet"/>
+      <w:lvlText w:val=""/>
+      <w:lvlJc w:val="left"/>
+      <w:pPr>
+        <w:tabs>
+          <w:tab w:val="num" w:pos="2160"/>
+        </w:tabs>
+        <w:ind w:left="2160" w:hanging="360"/>
+      </w:pPr>
+      <w:rPr>
+        <w:rFonts w:ascii="Wingdings" w:hAnsi="Wingdings" w:hint="default"/>
+        <w:sz w:val="20"/>
+      </w:rPr>
+    </w:lvl>
+    <w:lvl w:ilvl="3" w:tentative="1">
+      <w:start w:val="1"/>
+      <w:numFmt w:val="bullet"/>
+      <w:lvlText w:val=""/>
+      <w:lvlJc w:val="left"/>
+      <w:pPr>
+        <w:tabs>
+          <w:tab w:val="num" w:pos="2880"/>
+        </w:tabs>
+        <w:ind w:left="2880" w:hanging="360"/>
+      </w:pPr>
+      <w:rPr>
+        <w:rFonts w:ascii="Wingdings" w:hAnsi="Wingdings" w:hint="default"/>
+        <w:sz w:val="20"/>
+      </w:rPr>
+    </w:lvl>
+    <w:lvl w:ilvl="4" w:tentative="1">
+      <w:start w:val="1"/>
+      <w:numFmt w:val="bullet"/>
+      <w:lvlText w:val=""/>
+      <w:lvlJc w:val="left"/>
+      <w:pPr>
+        <w:tabs>
+          <w:tab w:val="num" w:pos="3600"/>
+        </w:tabs>
+        <w:ind w:left="3600" w:hanging="360"/>
+      </w:pPr>
+      <w:rPr>
+        <w:rFonts w:ascii="Wingdings" w:hAnsi="Wingdings" w:hint="default"/>
+        <w:sz w:val="20"/>
+      </w:rPr>
+    </w:lvl>
+    <w:lvl w:ilvl="5" w:tentative="1">
+      <w:start w:val="1"/>
+      <w:numFmt w:val="bullet"/>
+      <w:lvlText w:val=""/>
+      <w:lvlJc w:val="left"/>
+      <w:pPr>
+        <w:tabs>
+          <w:tab w:val="num" w:pos="4320"/>
+        </w:tabs>
+        <w:ind w:left="4320" w:hanging="360"/>
+      </w:pPr>
+      <w:rPr>
+        <w:rFonts w:ascii="Wingdings" w:hAnsi="Wingdings" w:hint="default"/>
+        <w:sz w:val="20"/>
+      </w:rPr>
+    </w:lvl>
+    <w:lvl w:ilvl="6" w:tentative="1">
+      <w:start w:val="1"/>
+      <w:numFmt w:val="bullet"/>
+      <w:lvlText w:val=""/>
+      <w:lvlJc w:val="left"/>
+      <w:pPr>
+        <w:tabs>
+          <w:tab w:val="num" w:pos="5040"/>
+        </w:tabs>
+        <w:ind w:left="5040" w:hanging="360"/>
+      </w:pPr>
+      <w:rPr>
+        <w:rFonts w:ascii="Wingdings" w:hAnsi="Wingdings" w:hint="default"/>
+        <w:sz w:val="20"/>
+      </w:rPr>
+    </w:lvl>
+    <w:lvl w:ilvl="7" w:tentative="1">
+      <w:start w:val="1"/>
+      <w:numFmt w:val="bullet"/>
+      <w:lvlText w:val=""/>
+      <w:lvlJc w:val="left"/>
+      <w:pPr>
+        <w:tabs>
+          <w:tab w:val="num" w:pos="5760"/>
+        </w:tabs>
+        <w:ind w:left="5760" w:hanging="360"/>
+      </w:pPr>
+      <w:rPr>
+        <w:rFonts w:ascii="Wingdings" w:hAnsi="Wingdings" w:hint="default"/>
+        <w:sz w:val="20"/>
+      </w:rPr>
+    </w:lvl>
+    <w:lvl w:ilvl="8" w:tentative="1">
+      <w:start w:val="1"/>
+      <w:numFmt w:val="bullet"/>
+      <w:lvlText w:val=""/>
+      <w:lvlJc w:val="left"/>
+      <w:pPr>
+        <w:tabs>
+          <w:tab w:val="num" w:pos="6480"/>
+        </w:tabs>
+        <w:ind w:left="6480" w:hanging="360"/>
+      </w:pPr>
+      <w:rPr>
+        <w:rFonts w:ascii="Wingdings" w:hAnsi="Wingdings" w:hint="default"/>
+        <w:sz w:val="20"/>
+      </w:rPr>
+    </w:lvl>
+  </w:abstractNum>
+  <w:abstractNum w:abstractNumId="37" w15:restartNumberingAfterBreak="0">
+    <w:nsid w:val="31F01409"/>
+    <w:multiLevelType w:val="multilevel"/>
+    <w:tmpl w:val="AE14EC18"/>
+    <w:lvl w:ilvl="0">
+      <w:start w:val="1"/>
+      <w:numFmt w:val="bullet"/>
+      <w:lvlText w:val=""/>
+      <w:lvlJc w:val="left"/>
+      <w:pPr>
+        <w:tabs>
+          <w:tab w:val="num" w:pos="720"/>
+        </w:tabs>
+        <w:ind w:left="720" w:hanging="360"/>
+      </w:pPr>
+      <w:rPr>
+        <w:rFonts w:ascii="Symbol" w:hAnsi="Symbol" w:hint="default"/>
+        <w:sz w:val="20"/>
+      </w:rPr>
+    </w:lvl>
+    <w:lvl w:ilvl="1" w:tentative="1">
+      <w:start w:val="1"/>
+      <w:numFmt w:val="bullet"/>
+      <w:lvlText w:val="o"/>
+      <w:lvlJc w:val="left"/>
+      <w:pPr>
+        <w:tabs>
+          <w:tab w:val="num" w:pos="1440"/>
+        </w:tabs>
+        <w:ind w:left="1440" w:hanging="360"/>
+      </w:pPr>
+      <w:rPr>
+        <w:rFonts w:ascii="Courier New" w:hAnsi="Courier New" w:hint="default"/>
+        <w:sz w:val="20"/>
+      </w:rPr>
+    </w:lvl>
+    <w:lvl w:ilvl="2" w:tentative="1">
+      <w:start w:val="1"/>
+      <w:numFmt w:val="bullet"/>
+      <w:lvlText w:val=""/>
+      <w:lvlJc w:val="left"/>
+      <w:pPr>
+        <w:tabs>
+          <w:tab w:val="num" w:pos="2160"/>
+        </w:tabs>
+        <w:ind w:left="2160" w:hanging="360"/>
+      </w:pPr>
+      <w:rPr>
+        <w:rFonts w:ascii="Wingdings" w:hAnsi="Wingdings" w:hint="default"/>
+        <w:sz w:val="20"/>
+      </w:rPr>
+    </w:lvl>
+    <w:lvl w:ilvl="3" w:tentative="1">
+      <w:start w:val="1"/>
+      <w:numFmt w:val="bullet"/>
+      <w:lvlText w:val=""/>
+      <w:lvlJc w:val="left"/>
+      <w:pPr>
+        <w:tabs>
+          <w:tab w:val="num" w:pos="2880"/>
+        </w:tabs>
+        <w:ind w:left="2880" w:hanging="360"/>
+      </w:pPr>
+      <w:rPr>
+        <w:rFonts w:ascii="Wingdings" w:hAnsi="Wingdings" w:hint="default"/>
+        <w:sz w:val="20"/>
+      </w:rPr>
+    </w:lvl>
+    <w:lvl w:ilvl="4" w:tentative="1">
+      <w:start w:val="1"/>
+      <w:numFmt w:val="bullet"/>
+      <w:lvlText w:val=""/>
+      <w:lvlJc w:val="left"/>
+      <w:pPr>
+        <w:tabs>
+          <w:tab w:val="num" w:pos="3600"/>
+        </w:tabs>
+        <w:ind w:left="3600" w:hanging="360"/>
+      </w:pPr>
+      <w:rPr>
+        <w:rFonts w:ascii="Wingdings" w:hAnsi="Wingdings" w:hint="default"/>
+        <w:sz w:val="20"/>
+      </w:rPr>
+    </w:lvl>
+    <w:lvl w:ilvl="5" w:tentative="1">
+      <w:start w:val="1"/>
+      <w:numFmt w:val="bullet"/>
+      <w:lvlText w:val=""/>
+      <w:lvlJc w:val="left"/>
+      <w:pPr>
+        <w:tabs>
+          <w:tab w:val="num" w:pos="4320"/>
+        </w:tabs>
+        <w:ind w:left="4320" w:hanging="360"/>
+      </w:pPr>
+      <w:rPr>
+        <w:rFonts w:ascii="Wingdings" w:hAnsi="Wingdings" w:hint="default"/>
+        <w:sz w:val="20"/>
+      </w:rPr>
+    </w:lvl>
+    <w:lvl w:ilvl="6" w:tentative="1">
+      <w:start w:val="1"/>
+      <w:numFmt w:val="bullet"/>
+      <w:lvlText w:val=""/>
+      <w:lvlJc w:val="left"/>
+      <w:pPr>
+        <w:tabs>
+          <w:tab w:val="num" w:pos="5040"/>
+        </w:tabs>
+        <w:ind w:left="5040" w:hanging="360"/>
+      </w:pPr>
+      <w:rPr>
+        <w:rFonts w:ascii="Wingdings" w:hAnsi="Wingdings" w:hint="default"/>
+        <w:sz w:val="20"/>
+      </w:rPr>
+    </w:lvl>
+    <w:lvl w:ilvl="7" w:tentative="1">
+      <w:start w:val="1"/>
+      <w:numFmt w:val="bullet"/>
+      <w:lvlText w:val=""/>
+      <w:lvlJc w:val="left"/>
+      <w:pPr>
+        <w:tabs>
+          <w:tab w:val="num" w:pos="5760"/>
+        </w:tabs>
+        <w:ind w:left="5760" w:hanging="360"/>
+      </w:pPr>
+      <w:rPr>
+        <w:rFonts w:ascii="Wingdings" w:hAnsi="Wingdings" w:hint="default"/>
+        <w:sz w:val="20"/>
+      </w:rPr>
+    </w:lvl>
+    <w:lvl w:ilvl="8" w:tentative="1">
+      <w:start w:val="1"/>
+      <w:numFmt w:val="bullet"/>
+      <w:lvlText w:val=""/>
+      <w:lvlJc w:val="left"/>
+      <w:pPr>
+        <w:tabs>
+          <w:tab w:val="num" w:pos="6480"/>
+        </w:tabs>
+        <w:ind w:left="6480" w:hanging="360"/>
+      </w:pPr>
+      <w:rPr>
+        <w:rFonts w:ascii="Wingdings" w:hAnsi="Wingdings" w:hint="default"/>
+        <w:sz w:val="20"/>
+      </w:rPr>
+    </w:lvl>
+  </w:abstractNum>
+  <w:abstractNum w:abstractNumId="38" w15:restartNumberingAfterBreak="0">
     <w:nsid w:val="32E125F0"/>
     <w:multiLevelType w:val="multilevel"/>
     <w:tmpl w:val="4A3C68AA"/>
@@ -7724,7 +9544,7 @@
       </w:rPr>
     </w:lvl>
   </w:abstractNum>
-  <w:abstractNum w:abstractNumId="31" w15:restartNumberingAfterBreak="0">
+  <w:abstractNum w:abstractNumId="39" w15:restartNumberingAfterBreak="0">
     <w:nsid w:val="345318B1"/>
     <w:multiLevelType w:val="multilevel"/>
     <w:tmpl w:val="E22691B0"/>
@@ -7873,7 +9693,7 @@
       </w:rPr>
     </w:lvl>
   </w:abstractNum>
-  <w:abstractNum w:abstractNumId="32" w15:restartNumberingAfterBreak="0">
+  <w:abstractNum w:abstractNumId="40" w15:restartNumberingAfterBreak="0">
     <w:nsid w:val="3483363D"/>
     <w:multiLevelType w:val="multilevel"/>
     <w:tmpl w:val="249A8D4E"/>
@@ -8022,7 +9842,7 @@
       </w:rPr>
     </w:lvl>
   </w:abstractNum>
-  <w:abstractNum w:abstractNumId="33" w15:restartNumberingAfterBreak="0">
+  <w:abstractNum w:abstractNumId="41" w15:restartNumberingAfterBreak="0">
     <w:nsid w:val="34A9786B"/>
     <w:multiLevelType w:val="multilevel"/>
     <w:tmpl w:val="FDDA1C98"/>
@@ -8171,7 +9991,7 @@
       </w:rPr>
     </w:lvl>
   </w:abstractNum>
-  <w:abstractNum w:abstractNumId="34" w15:restartNumberingAfterBreak="0">
+  <w:abstractNum w:abstractNumId="42" w15:restartNumberingAfterBreak="0">
     <w:nsid w:val="37046099"/>
     <w:multiLevelType w:val="multilevel"/>
     <w:tmpl w:val="1EDC5206"/>
@@ -8320,7 +10140,156 @@
       </w:rPr>
     </w:lvl>
   </w:abstractNum>
-  <w:abstractNum w:abstractNumId="35" w15:restartNumberingAfterBreak="0">
+  <w:abstractNum w:abstractNumId="43" w15:restartNumberingAfterBreak="0">
+    <w:nsid w:val="376E2D49"/>
+    <w:multiLevelType w:val="multilevel"/>
+    <w:tmpl w:val="2A5453D4"/>
+    <w:lvl w:ilvl="0">
+      <w:start w:val="1"/>
+      <w:numFmt w:val="bullet"/>
+      <w:lvlText w:val=""/>
+      <w:lvlJc w:val="left"/>
+      <w:pPr>
+        <w:tabs>
+          <w:tab w:val="num" w:pos="720"/>
+        </w:tabs>
+        <w:ind w:left="720" w:hanging="360"/>
+      </w:pPr>
+      <w:rPr>
+        <w:rFonts w:ascii="Symbol" w:hAnsi="Symbol" w:hint="default"/>
+        <w:sz w:val="20"/>
+      </w:rPr>
+    </w:lvl>
+    <w:lvl w:ilvl="1" w:tentative="1">
+      <w:start w:val="1"/>
+      <w:numFmt w:val="bullet"/>
+      <w:lvlText w:val="o"/>
+      <w:lvlJc w:val="left"/>
+      <w:pPr>
+        <w:tabs>
+          <w:tab w:val="num" w:pos="1440"/>
+        </w:tabs>
+        <w:ind w:left="1440" w:hanging="360"/>
+      </w:pPr>
+      <w:rPr>
+        <w:rFonts w:ascii="Courier New" w:hAnsi="Courier New" w:hint="default"/>
+        <w:sz w:val="20"/>
+      </w:rPr>
+    </w:lvl>
+    <w:lvl w:ilvl="2" w:tentative="1">
+      <w:start w:val="1"/>
+      <w:numFmt w:val="bullet"/>
+      <w:lvlText w:val=""/>
+      <w:lvlJc w:val="left"/>
+      <w:pPr>
+        <w:tabs>
+          <w:tab w:val="num" w:pos="2160"/>
+        </w:tabs>
+        <w:ind w:left="2160" w:hanging="360"/>
+      </w:pPr>
+      <w:rPr>
+        <w:rFonts w:ascii="Wingdings" w:hAnsi="Wingdings" w:hint="default"/>
+        <w:sz w:val="20"/>
+      </w:rPr>
+    </w:lvl>
+    <w:lvl w:ilvl="3" w:tentative="1">
+      <w:start w:val="1"/>
+      <w:numFmt w:val="bullet"/>
+      <w:lvlText w:val=""/>
+      <w:lvlJc w:val="left"/>
+      <w:pPr>
+        <w:tabs>
+          <w:tab w:val="num" w:pos="2880"/>
+        </w:tabs>
+        <w:ind w:left="2880" w:hanging="360"/>
+      </w:pPr>
+      <w:rPr>
+        <w:rFonts w:ascii="Wingdings" w:hAnsi="Wingdings" w:hint="default"/>
+        <w:sz w:val="20"/>
+      </w:rPr>
+    </w:lvl>
+    <w:lvl w:ilvl="4" w:tentative="1">
+      <w:start w:val="1"/>
+      <w:numFmt w:val="bullet"/>
+      <w:lvlText w:val=""/>
+      <w:lvlJc w:val="left"/>
+      <w:pPr>
+        <w:tabs>
+          <w:tab w:val="num" w:pos="3600"/>
+        </w:tabs>
+        <w:ind w:left="3600" w:hanging="360"/>
+      </w:pPr>
+      <w:rPr>
+        <w:rFonts w:ascii="Wingdings" w:hAnsi="Wingdings" w:hint="default"/>
+        <w:sz w:val="20"/>
+      </w:rPr>
+    </w:lvl>
+    <w:lvl w:ilvl="5" w:tentative="1">
+      <w:start w:val="1"/>
+      <w:numFmt w:val="bullet"/>
+      <w:lvlText w:val=""/>
+      <w:lvlJc w:val="left"/>
+      <w:pPr>
+        <w:tabs>
+          <w:tab w:val="num" w:pos="4320"/>
+        </w:tabs>
+        <w:ind w:left="4320" w:hanging="360"/>
+      </w:pPr>
+      <w:rPr>
+        <w:rFonts w:ascii="Wingdings" w:hAnsi="Wingdings" w:hint="default"/>
+        <w:sz w:val="20"/>
+      </w:rPr>
+    </w:lvl>
+    <w:lvl w:ilvl="6" w:tentative="1">
+      <w:start w:val="1"/>
+      <w:numFmt w:val="bullet"/>
+      <w:lvlText w:val=""/>
+      <w:lvlJc w:val="left"/>
+      <w:pPr>
+        <w:tabs>
+          <w:tab w:val="num" w:pos="5040"/>
+        </w:tabs>
+        <w:ind w:left="5040" w:hanging="360"/>
+      </w:pPr>
+      <w:rPr>
+        <w:rFonts w:ascii="Wingdings" w:hAnsi="Wingdings" w:hint="default"/>
+        <w:sz w:val="20"/>
+      </w:rPr>
+    </w:lvl>
+    <w:lvl w:ilvl="7" w:tentative="1">
+      <w:start w:val="1"/>
+      <w:numFmt w:val="bullet"/>
+      <w:lvlText w:val=""/>
+      <w:lvlJc w:val="left"/>
+      <w:pPr>
+        <w:tabs>
+          <w:tab w:val="num" w:pos="5760"/>
+        </w:tabs>
+        <w:ind w:left="5760" w:hanging="360"/>
+      </w:pPr>
+      <w:rPr>
+        <w:rFonts w:ascii="Wingdings" w:hAnsi="Wingdings" w:hint="default"/>
+        <w:sz w:val="20"/>
+      </w:rPr>
+    </w:lvl>
+    <w:lvl w:ilvl="8" w:tentative="1">
+      <w:start w:val="1"/>
+      <w:numFmt w:val="bullet"/>
+      <w:lvlText w:val=""/>
+      <w:lvlJc w:val="left"/>
+      <w:pPr>
+        <w:tabs>
+          <w:tab w:val="num" w:pos="6480"/>
+        </w:tabs>
+        <w:ind w:left="6480" w:hanging="360"/>
+      </w:pPr>
+      <w:rPr>
+        <w:rFonts w:ascii="Wingdings" w:hAnsi="Wingdings" w:hint="default"/>
+        <w:sz w:val="20"/>
+      </w:rPr>
+    </w:lvl>
+  </w:abstractNum>
+  <w:abstractNum w:abstractNumId="44" w15:restartNumberingAfterBreak="0">
     <w:nsid w:val="379B7A4B"/>
     <w:multiLevelType w:val="multilevel"/>
     <w:tmpl w:val="D3B0903E"/>
@@ -8469,7 +10438,7 @@
       </w:rPr>
     </w:lvl>
   </w:abstractNum>
-  <w:abstractNum w:abstractNumId="36" w15:restartNumberingAfterBreak="0">
+  <w:abstractNum w:abstractNumId="45" w15:restartNumberingAfterBreak="0">
     <w:nsid w:val="393C00F3"/>
     <w:multiLevelType w:val="multilevel"/>
     <w:tmpl w:val="13806402"/>
@@ -8618,7 +10587,7 @@
       </w:rPr>
     </w:lvl>
   </w:abstractNum>
-  <w:abstractNum w:abstractNumId="37" w15:restartNumberingAfterBreak="0">
+  <w:abstractNum w:abstractNumId="46" w15:restartNumberingAfterBreak="0">
     <w:nsid w:val="3CEE2942"/>
     <w:multiLevelType w:val="multilevel"/>
     <w:tmpl w:val="1B76C9E8"/>
@@ -8767,7 +10736,7 @@
       </w:rPr>
     </w:lvl>
   </w:abstractNum>
-  <w:abstractNum w:abstractNumId="38" w15:restartNumberingAfterBreak="0">
+  <w:abstractNum w:abstractNumId="47" w15:restartNumberingAfterBreak="0">
     <w:nsid w:val="3D983783"/>
     <w:multiLevelType w:val="multilevel"/>
     <w:tmpl w:val="A5EA85A8"/>
@@ -8916,7 +10885,7 @@
       </w:rPr>
     </w:lvl>
   </w:abstractNum>
-  <w:abstractNum w:abstractNumId="39" w15:restartNumberingAfterBreak="0">
+  <w:abstractNum w:abstractNumId="48" w15:restartNumberingAfterBreak="0">
     <w:nsid w:val="3E4C3C99"/>
     <w:multiLevelType w:val="multilevel"/>
     <w:tmpl w:val="F97007F4"/>
@@ -9065,7 +11034,156 @@
       </w:rPr>
     </w:lvl>
   </w:abstractNum>
-  <w:abstractNum w:abstractNumId="40" w15:restartNumberingAfterBreak="0">
+  <w:abstractNum w:abstractNumId="49" w15:restartNumberingAfterBreak="0">
+    <w:nsid w:val="3F7236AA"/>
+    <w:multiLevelType w:val="multilevel"/>
+    <w:tmpl w:val="CD2EDDCA"/>
+    <w:lvl w:ilvl="0">
+      <w:start w:val="1"/>
+      <w:numFmt w:val="bullet"/>
+      <w:lvlText w:val=""/>
+      <w:lvlJc w:val="left"/>
+      <w:pPr>
+        <w:tabs>
+          <w:tab w:val="num" w:pos="720"/>
+        </w:tabs>
+        <w:ind w:left="720" w:hanging="360"/>
+      </w:pPr>
+      <w:rPr>
+        <w:rFonts w:ascii="Symbol" w:hAnsi="Symbol" w:hint="default"/>
+        <w:sz w:val="20"/>
+      </w:rPr>
+    </w:lvl>
+    <w:lvl w:ilvl="1" w:tentative="1">
+      <w:start w:val="1"/>
+      <w:numFmt w:val="bullet"/>
+      <w:lvlText w:val="o"/>
+      <w:lvlJc w:val="left"/>
+      <w:pPr>
+        <w:tabs>
+          <w:tab w:val="num" w:pos="1440"/>
+        </w:tabs>
+        <w:ind w:left="1440" w:hanging="360"/>
+      </w:pPr>
+      <w:rPr>
+        <w:rFonts w:ascii="Courier New" w:hAnsi="Courier New" w:hint="default"/>
+        <w:sz w:val="20"/>
+      </w:rPr>
+    </w:lvl>
+    <w:lvl w:ilvl="2" w:tentative="1">
+      <w:start w:val="1"/>
+      <w:numFmt w:val="bullet"/>
+      <w:lvlText w:val=""/>
+      <w:lvlJc w:val="left"/>
+      <w:pPr>
+        <w:tabs>
+          <w:tab w:val="num" w:pos="2160"/>
+        </w:tabs>
+        <w:ind w:left="2160" w:hanging="360"/>
+      </w:pPr>
+      <w:rPr>
+        <w:rFonts w:ascii="Wingdings" w:hAnsi="Wingdings" w:hint="default"/>
+        <w:sz w:val="20"/>
+      </w:rPr>
+    </w:lvl>
+    <w:lvl w:ilvl="3" w:tentative="1">
+      <w:start w:val="1"/>
+      <w:numFmt w:val="bullet"/>
+      <w:lvlText w:val=""/>
+      <w:lvlJc w:val="left"/>
+      <w:pPr>
+        <w:tabs>
+          <w:tab w:val="num" w:pos="2880"/>
+        </w:tabs>
+        <w:ind w:left="2880" w:hanging="360"/>
+      </w:pPr>
+      <w:rPr>
+        <w:rFonts w:ascii="Wingdings" w:hAnsi="Wingdings" w:hint="default"/>
+        <w:sz w:val="20"/>
+      </w:rPr>
+    </w:lvl>
+    <w:lvl w:ilvl="4" w:tentative="1">
+      <w:start w:val="1"/>
+      <w:numFmt w:val="bullet"/>
+      <w:lvlText w:val=""/>
+      <w:lvlJc w:val="left"/>
+      <w:pPr>
+        <w:tabs>
+          <w:tab w:val="num" w:pos="3600"/>
+        </w:tabs>
+        <w:ind w:left="3600" w:hanging="360"/>
+      </w:pPr>
+      <w:rPr>
+        <w:rFonts w:ascii="Wingdings" w:hAnsi="Wingdings" w:hint="default"/>
+        <w:sz w:val="20"/>
+      </w:rPr>
+    </w:lvl>
+    <w:lvl w:ilvl="5" w:tentative="1">
+      <w:start w:val="1"/>
+      <w:numFmt w:val="bullet"/>
+      <w:lvlText w:val=""/>
+      <w:lvlJc w:val="left"/>
+      <w:pPr>
+        <w:tabs>
+          <w:tab w:val="num" w:pos="4320"/>
+        </w:tabs>
+        <w:ind w:left="4320" w:hanging="360"/>
+      </w:pPr>
+      <w:rPr>
+        <w:rFonts w:ascii="Wingdings" w:hAnsi="Wingdings" w:hint="default"/>
+        <w:sz w:val="20"/>
+      </w:rPr>
+    </w:lvl>
+    <w:lvl w:ilvl="6" w:tentative="1">
+      <w:start w:val="1"/>
+      <w:numFmt w:val="bullet"/>
+      <w:lvlText w:val=""/>
+      <w:lvlJc w:val="left"/>
+      <w:pPr>
+        <w:tabs>
+          <w:tab w:val="num" w:pos="5040"/>
+        </w:tabs>
+        <w:ind w:left="5040" w:hanging="360"/>
+      </w:pPr>
+      <w:rPr>
+        <w:rFonts w:ascii="Wingdings" w:hAnsi="Wingdings" w:hint="default"/>
+        <w:sz w:val="20"/>
+      </w:rPr>
+    </w:lvl>
+    <w:lvl w:ilvl="7" w:tentative="1">
+      <w:start w:val="1"/>
+      <w:numFmt w:val="bullet"/>
+      <w:lvlText w:val=""/>
+      <w:lvlJc w:val="left"/>
+      <w:pPr>
+        <w:tabs>
+          <w:tab w:val="num" w:pos="5760"/>
+        </w:tabs>
+        <w:ind w:left="5760" w:hanging="360"/>
+      </w:pPr>
+      <w:rPr>
+        <w:rFonts w:ascii="Wingdings" w:hAnsi="Wingdings" w:hint="default"/>
+        <w:sz w:val="20"/>
+      </w:rPr>
+    </w:lvl>
+    <w:lvl w:ilvl="8" w:tentative="1">
+      <w:start w:val="1"/>
+      <w:numFmt w:val="bullet"/>
+      <w:lvlText w:val=""/>
+      <w:lvlJc w:val="left"/>
+      <w:pPr>
+        <w:tabs>
+          <w:tab w:val="num" w:pos="6480"/>
+        </w:tabs>
+        <w:ind w:left="6480" w:hanging="360"/>
+      </w:pPr>
+      <w:rPr>
+        <w:rFonts w:ascii="Wingdings" w:hAnsi="Wingdings" w:hint="default"/>
+        <w:sz w:val="20"/>
+      </w:rPr>
+    </w:lvl>
+  </w:abstractNum>
+  <w:abstractNum w:abstractNumId="50" w15:restartNumberingAfterBreak="0">
     <w:nsid w:val="3FCC2C2A"/>
     <w:multiLevelType w:val="multilevel"/>
     <w:tmpl w:val="E47287F4"/>
@@ -9214,7 +11332,156 @@
       </w:rPr>
     </w:lvl>
   </w:abstractNum>
-  <w:abstractNum w:abstractNumId="41" w15:restartNumberingAfterBreak="0">
+  <w:abstractNum w:abstractNumId="51" w15:restartNumberingAfterBreak="0">
+    <w:nsid w:val="40E60270"/>
+    <w:multiLevelType w:val="multilevel"/>
+    <w:tmpl w:val="85A20806"/>
+    <w:lvl w:ilvl="0">
+      <w:start w:val="1"/>
+      <w:numFmt w:val="bullet"/>
+      <w:lvlText w:val=""/>
+      <w:lvlJc w:val="left"/>
+      <w:pPr>
+        <w:tabs>
+          <w:tab w:val="num" w:pos="720"/>
+        </w:tabs>
+        <w:ind w:left="720" w:hanging="360"/>
+      </w:pPr>
+      <w:rPr>
+        <w:rFonts w:ascii="Symbol" w:hAnsi="Symbol" w:hint="default"/>
+        <w:sz w:val="20"/>
+      </w:rPr>
+    </w:lvl>
+    <w:lvl w:ilvl="1" w:tentative="1">
+      <w:start w:val="1"/>
+      <w:numFmt w:val="bullet"/>
+      <w:lvlText w:val="o"/>
+      <w:lvlJc w:val="left"/>
+      <w:pPr>
+        <w:tabs>
+          <w:tab w:val="num" w:pos="1440"/>
+        </w:tabs>
+        <w:ind w:left="1440" w:hanging="360"/>
+      </w:pPr>
+      <w:rPr>
+        <w:rFonts w:ascii="Courier New" w:hAnsi="Courier New" w:hint="default"/>
+        <w:sz w:val="20"/>
+      </w:rPr>
+    </w:lvl>
+    <w:lvl w:ilvl="2" w:tentative="1">
+      <w:start w:val="1"/>
+      <w:numFmt w:val="bullet"/>
+      <w:lvlText w:val=""/>
+      <w:lvlJc w:val="left"/>
+      <w:pPr>
+        <w:tabs>
+          <w:tab w:val="num" w:pos="2160"/>
+        </w:tabs>
+        <w:ind w:left="2160" w:hanging="360"/>
+      </w:pPr>
+      <w:rPr>
+        <w:rFonts w:ascii="Wingdings" w:hAnsi="Wingdings" w:hint="default"/>
+        <w:sz w:val="20"/>
+      </w:rPr>
+    </w:lvl>
+    <w:lvl w:ilvl="3" w:tentative="1">
+      <w:start w:val="1"/>
+      <w:numFmt w:val="bullet"/>
+      <w:lvlText w:val=""/>
+      <w:lvlJc w:val="left"/>
+      <w:pPr>
+        <w:tabs>
+          <w:tab w:val="num" w:pos="2880"/>
+        </w:tabs>
+        <w:ind w:left="2880" w:hanging="360"/>
+      </w:pPr>
+      <w:rPr>
+        <w:rFonts w:ascii="Wingdings" w:hAnsi="Wingdings" w:hint="default"/>
+        <w:sz w:val="20"/>
+      </w:rPr>
+    </w:lvl>
+    <w:lvl w:ilvl="4" w:tentative="1">
+      <w:start w:val="1"/>
+      <w:numFmt w:val="bullet"/>
+      <w:lvlText w:val=""/>
+      <w:lvlJc w:val="left"/>
+      <w:pPr>
+        <w:tabs>
+          <w:tab w:val="num" w:pos="3600"/>
+        </w:tabs>
+        <w:ind w:left="3600" w:hanging="360"/>
+      </w:pPr>
+      <w:rPr>
+        <w:rFonts w:ascii="Wingdings" w:hAnsi="Wingdings" w:hint="default"/>
+        <w:sz w:val="20"/>
+      </w:rPr>
+    </w:lvl>
+    <w:lvl w:ilvl="5" w:tentative="1">
+      <w:start w:val="1"/>
+      <w:numFmt w:val="bullet"/>
+      <w:lvlText w:val=""/>
+      <w:lvlJc w:val="left"/>
+      <w:pPr>
+        <w:tabs>
+          <w:tab w:val="num" w:pos="4320"/>
+        </w:tabs>
+        <w:ind w:left="4320" w:hanging="360"/>
+      </w:pPr>
+      <w:rPr>
+        <w:rFonts w:ascii="Wingdings" w:hAnsi="Wingdings" w:hint="default"/>
+        <w:sz w:val="20"/>
+      </w:rPr>
+    </w:lvl>
+    <w:lvl w:ilvl="6" w:tentative="1">
+      <w:start w:val="1"/>
+      <w:numFmt w:val="bullet"/>
+      <w:lvlText w:val=""/>
+      <w:lvlJc w:val="left"/>
+      <w:pPr>
+        <w:tabs>
+          <w:tab w:val="num" w:pos="5040"/>
+        </w:tabs>
+        <w:ind w:left="5040" w:hanging="360"/>
+      </w:pPr>
+      <w:rPr>
+        <w:rFonts w:ascii="Wingdings" w:hAnsi="Wingdings" w:hint="default"/>
+        <w:sz w:val="20"/>
+      </w:rPr>
+    </w:lvl>
+    <w:lvl w:ilvl="7" w:tentative="1">
+      <w:start w:val="1"/>
+      <w:numFmt w:val="bullet"/>
+      <w:lvlText w:val=""/>
+      <w:lvlJc w:val="left"/>
+      <w:pPr>
+        <w:tabs>
+          <w:tab w:val="num" w:pos="5760"/>
+        </w:tabs>
+        <w:ind w:left="5760" w:hanging="360"/>
+      </w:pPr>
+      <w:rPr>
+        <w:rFonts w:ascii="Wingdings" w:hAnsi="Wingdings" w:hint="default"/>
+        <w:sz w:val="20"/>
+      </w:rPr>
+    </w:lvl>
+    <w:lvl w:ilvl="8" w:tentative="1">
+      <w:start w:val="1"/>
+      <w:numFmt w:val="bullet"/>
+      <w:lvlText w:val=""/>
+      <w:lvlJc w:val="left"/>
+      <w:pPr>
+        <w:tabs>
+          <w:tab w:val="num" w:pos="6480"/>
+        </w:tabs>
+        <w:ind w:left="6480" w:hanging="360"/>
+      </w:pPr>
+      <w:rPr>
+        <w:rFonts w:ascii="Wingdings" w:hAnsi="Wingdings" w:hint="default"/>
+        <w:sz w:val="20"/>
+      </w:rPr>
+    </w:lvl>
+  </w:abstractNum>
+  <w:abstractNum w:abstractNumId="52" w15:restartNumberingAfterBreak="0">
     <w:nsid w:val="43611B06"/>
     <w:multiLevelType w:val="multilevel"/>
     <w:tmpl w:val="CCC42E5E"/>
@@ -9363,7 +11630,7 @@
       </w:rPr>
     </w:lvl>
   </w:abstractNum>
-  <w:abstractNum w:abstractNumId="42" w15:restartNumberingAfterBreak="0">
+  <w:abstractNum w:abstractNumId="53" w15:restartNumberingAfterBreak="0">
     <w:nsid w:val="45B741B9"/>
     <w:multiLevelType w:val="multilevel"/>
     <w:tmpl w:val="5394DD3E"/>
@@ -9512,7 +11779,156 @@
       </w:rPr>
     </w:lvl>
   </w:abstractNum>
-  <w:abstractNum w:abstractNumId="43" w15:restartNumberingAfterBreak="0">
+  <w:abstractNum w:abstractNumId="54" w15:restartNumberingAfterBreak="0">
+    <w:nsid w:val="46486A88"/>
+    <w:multiLevelType w:val="multilevel"/>
+    <w:tmpl w:val="7BCA6AFA"/>
+    <w:lvl w:ilvl="0">
+      <w:start w:val="1"/>
+      <w:numFmt w:val="bullet"/>
+      <w:lvlText w:val=""/>
+      <w:lvlJc w:val="left"/>
+      <w:pPr>
+        <w:tabs>
+          <w:tab w:val="num" w:pos="720"/>
+        </w:tabs>
+        <w:ind w:left="720" w:hanging="360"/>
+      </w:pPr>
+      <w:rPr>
+        <w:rFonts w:ascii="Symbol" w:hAnsi="Symbol" w:hint="default"/>
+        <w:sz w:val="20"/>
+      </w:rPr>
+    </w:lvl>
+    <w:lvl w:ilvl="1" w:tentative="1">
+      <w:start w:val="1"/>
+      <w:numFmt w:val="bullet"/>
+      <w:lvlText w:val="o"/>
+      <w:lvlJc w:val="left"/>
+      <w:pPr>
+        <w:tabs>
+          <w:tab w:val="num" w:pos="1440"/>
+        </w:tabs>
+        <w:ind w:left="1440" w:hanging="360"/>
+      </w:pPr>
+      <w:rPr>
+        <w:rFonts w:ascii="Courier New" w:hAnsi="Courier New" w:hint="default"/>
+        <w:sz w:val="20"/>
+      </w:rPr>
+    </w:lvl>
+    <w:lvl w:ilvl="2" w:tentative="1">
+      <w:start w:val="1"/>
+      <w:numFmt w:val="bullet"/>
+      <w:lvlText w:val=""/>
+      <w:lvlJc w:val="left"/>
+      <w:pPr>
+        <w:tabs>
+          <w:tab w:val="num" w:pos="2160"/>
+        </w:tabs>
+        <w:ind w:left="2160" w:hanging="360"/>
+      </w:pPr>
+      <w:rPr>
+        <w:rFonts w:ascii="Wingdings" w:hAnsi="Wingdings" w:hint="default"/>
+        <w:sz w:val="20"/>
+      </w:rPr>
+    </w:lvl>
+    <w:lvl w:ilvl="3" w:tentative="1">
+      <w:start w:val="1"/>
+      <w:numFmt w:val="bullet"/>
+      <w:lvlText w:val=""/>
+      <w:lvlJc w:val="left"/>
+      <w:pPr>
+        <w:tabs>
+          <w:tab w:val="num" w:pos="2880"/>
+        </w:tabs>
+        <w:ind w:left="2880" w:hanging="360"/>
+      </w:pPr>
+      <w:rPr>
+        <w:rFonts w:ascii="Wingdings" w:hAnsi="Wingdings" w:hint="default"/>
+        <w:sz w:val="20"/>
+      </w:rPr>
+    </w:lvl>
+    <w:lvl w:ilvl="4" w:tentative="1">
+      <w:start w:val="1"/>
+      <w:numFmt w:val="bullet"/>
+      <w:lvlText w:val=""/>
+      <w:lvlJc w:val="left"/>
+      <w:pPr>
+        <w:tabs>
+          <w:tab w:val="num" w:pos="3600"/>
+        </w:tabs>
+        <w:ind w:left="3600" w:hanging="360"/>
+      </w:pPr>
+      <w:rPr>
+        <w:rFonts w:ascii="Wingdings" w:hAnsi="Wingdings" w:hint="default"/>
+        <w:sz w:val="20"/>
+      </w:rPr>
+    </w:lvl>
+    <w:lvl w:ilvl="5" w:tentative="1">
+      <w:start w:val="1"/>
+      <w:numFmt w:val="bullet"/>
+      <w:lvlText w:val=""/>
+      <w:lvlJc w:val="left"/>
+      <w:pPr>
+        <w:tabs>
+          <w:tab w:val="num" w:pos="4320"/>
+        </w:tabs>
+        <w:ind w:left="4320" w:hanging="360"/>
+      </w:pPr>
+      <w:rPr>
+        <w:rFonts w:ascii="Wingdings" w:hAnsi="Wingdings" w:hint="default"/>
+        <w:sz w:val="20"/>
+      </w:rPr>
+    </w:lvl>
+    <w:lvl w:ilvl="6" w:tentative="1">
+      <w:start w:val="1"/>
+      <w:numFmt w:val="bullet"/>
+      <w:lvlText w:val=""/>
+      <w:lvlJc w:val="left"/>
+      <w:pPr>
+        <w:tabs>
+          <w:tab w:val="num" w:pos="5040"/>
+        </w:tabs>
+        <w:ind w:left="5040" w:hanging="360"/>
+      </w:pPr>
+      <w:rPr>
+        <w:rFonts w:ascii="Wingdings" w:hAnsi="Wingdings" w:hint="default"/>
+        <w:sz w:val="20"/>
+      </w:rPr>
+    </w:lvl>
+    <w:lvl w:ilvl="7" w:tentative="1">
+      <w:start w:val="1"/>
+      <w:numFmt w:val="bullet"/>
+      <w:lvlText w:val=""/>
+      <w:lvlJc w:val="left"/>
+      <w:pPr>
+        <w:tabs>
+          <w:tab w:val="num" w:pos="5760"/>
+        </w:tabs>
+        <w:ind w:left="5760" w:hanging="360"/>
+      </w:pPr>
+      <w:rPr>
+        <w:rFonts w:ascii="Wingdings" w:hAnsi="Wingdings" w:hint="default"/>
+        <w:sz w:val="20"/>
+      </w:rPr>
+    </w:lvl>
+    <w:lvl w:ilvl="8" w:tentative="1">
+      <w:start w:val="1"/>
+      <w:numFmt w:val="bullet"/>
+      <w:lvlText w:val=""/>
+      <w:lvlJc w:val="left"/>
+      <w:pPr>
+        <w:tabs>
+          <w:tab w:val="num" w:pos="6480"/>
+        </w:tabs>
+        <w:ind w:left="6480" w:hanging="360"/>
+      </w:pPr>
+      <w:rPr>
+        <w:rFonts w:ascii="Wingdings" w:hAnsi="Wingdings" w:hint="default"/>
+        <w:sz w:val="20"/>
+      </w:rPr>
+    </w:lvl>
+  </w:abstractNum>
+  <w:abstractNum w:abstractNumId="55" w15:restartNumberingAfterBreak="0">
     <w:nsid w:val="46805223"/>
     <w:multiLevelType w:val="multilevel"/>
     <w:tmpl w:val="A8B0EED2"/>
@@ -9661,7 +12077,7 @@
       </w:rPr>
     </w:lvl>
   </w:abstractNum>
-  <w:abstractNum w:abstractNumId="44" w15:restartNumberingAfterBreak="0">
+  <w:abstractNum w:abstractNumId="56" w15:restartNumberingAfterBreak="0">
     <w:nsid w:val="47A84289"/>
     <w:multiLevelType w:val="multilevel"/>
     <w:tmpl w:val="850A2F0E"/>
@@ -9810,7 +12226,7 @@
       </w:rPr>
     </w:lvl>
   </w:abstractNum>
-  <w:abstractNum w:abstractNumId="45" w15:restartNumberingAfterBreak="0">
+  <w:abstractNum w:abstractNumId="57" w15:restartNumberingAfterBreak="0">
     <w:nsid w:val="47D61EC6"/>
     <w:multiLevelType w:val="multilevel"/>
     <w:tmpl w:val="A43C269E"/>
@@ -9959,7 +12375,7 @@
       </w:rPr>
     </w:lvl>
   </w:abstractNum>
-  <w:abstractNum w:abstractNumId="46" w15:restartNumberingAfterBreak="0">
+  <w:abstractNum w:abstractNumId="58" w15:restartNumberingAfterBreak="0">
     <w:nsid w:val="48F81AC4"/>
     <w:multiLevelType w:val="multilevel"/>
     <w:tmpl w:val="039A9A20"/>
@@ -10108,7 +12524,7 @@
       </w:rPr>
     </w:lvl>
   </w:abstractNum>
-  <w:abstractNum w:abstractNumId="47" w15:restartNumberingAfterBreak="0">
+  <w:abstractNum w:abstractNumId="59" w15:restartNumberingAfterBreak="0">
     <w:nsid w:val="4A171373"/>
     <w:multiLevelType w:val="multilevel"/>
     <w:tmpl w:val="AA3A16FC"/>
@@ -10257,7 +12673,156 @@
       </w:rPr>
     </w:lvl>
   </w:abstractNum>
-  <w:abstractNum w:abstractNumId="48" w15:restartNumberingAfterBreak="0">
+  <w:abstractNum w:abstractNumId="60" w15:restartNumberingAfterBreak="0">
+    <w:nsid w:val="4A2A79EE"/>
+    <w:multiLevelType w:val="multilevel"/>
+    <w:tmpl w:val="00F62F2E"/>
+    <w:lvl w:ilvl="0">
+      <w:start w:val="1"/>
+      <w:numFmt w:val="bullet"/>
+      <w:lvlText w:val=""/>
+      <w:lvlJc w:val="left"/>
+      <w:pPr>
+        <w:tabs>
+          <w:tab w:val="num" w:pos="720"/>
+        </w:tabs>
+        <w:ind w:left="720" w:hanging="360"/>
+      </w:pPr>
+      <w:rPr>
+        <w:rFonts w:ascii="Symbol" w:hAnsi="Symbol" w:hint="default"/>
+        <w:sz w:val="20"/>
+      </w:rPr>
+    </w:lvl>
+    <w:lvl w:ilvl="1" w:tentative="1">
+      <w:start w:val="1"/>
+      <w:numFmt w:val="bullet"/>
+      <w:lvlText w:val="o"/>
+      <w:lvlJc w:val="left"/>
+      <w:pPr>
+        <w:tabs>
+          <w:tab w:val="num" w:pos="1440"/>
+        </w:tabs>
+        <w:ind w:left="1440" w:hanging="360"/>
+      </w:pPr>
+      <w:rPr>
+        <w:rFonts w:ascii="Courier New" w:hAnsi="Courier New" w:hint="default"/>
+        <w:sz w:val="20"/>
+      </w:rPr>
+    </w:lvl>
+    <w:lvl w:ilvl="2" w:tentative="1">
+      <w:start w:val="1"/>
+      <w:numFmt w:val="bullet"/>
+      <w:lvlText w:val=""/>
+      <w:lvlJc w:val="left"/>
+      <w:pPr>
+        <w:tabs>
+          <w:tab w:val="num" w:pos="2160"/>
+        </w:tabs>
+        <w:ind w:left="2160" w:hanging="360"/>
+      </w:pPr>
+      <w:rPr>
+        <w:rFonts w:ascii="Wingdings" w:hAnsi="Wingdings" w:hint="default"/>
+        <w:sz w:val="20"/>
+      </w:rPr>
+    </w:lvl>
+    <w:lvl w:ilvl="3" w:tentative="1">
+      <w:start w:val="1"/>
+      <w:numFmt w:val="bullet"/>
+      <w:lvlText w:val=""/>
+      <w:lvlJc w:val="left"/>
+      <w:pPr>
+        <w:tabs>
+          <w:tab w:val="num" w:pos="2880"/>
+        </w:tabs>
+        <w:ind w:left="2880" w:hanging="360"/>
+      </w:pPr>
+      <w:rPr>
+        <w:rFonts w:ascii="Wingdings" w:hAnsi="Wingdings" w:hint="default"/>
+        <w:sz w:val="20"/>
+      </w:rPr>
+    </w:lvl>
+    <w:lvl w:ilvl="4" w:tentative="1">
+      <w:start w:val="1"/>
+      <w:numFmt w:val="bullet"/>
+      <w:lvlText w:val=""/>
+      <w:lvlJc w:val="left"/>
+      <w:pPr>
+        <w:tabs>
+          <w:tab w:val="num" w:pos="3600"/>
+        </w:tabs>
+        <w:ind w:left="3600" w:hanging="360"/>
+      </w:pPr>
+      <w:rPr>
+        <w:rFonts w:ascii="Wingdings" w:hAnsi="Wingdings" w:hint="default"/>
+        <w:sz w:val="20"/>
+      </w:rPr>
+    </w:lvl>
+    <w:lvl w:ilvl="5" w:tentative="1">
+      <w:start w:val="1"/>
+      <w:numFmt w:val="bullet"/>
+      <w:lvlText w:val=""/>
+      <w:lvlJc w:val="left"/>
+      <w:pPr>
+        <w:tabs>
+          <w:tab w:val="num" w:pos="4320"/>
+        </w:tabs>
+        <w:ind w:left="4320" w:hanging="360"/>
+      </w:pPr>
+      <w:rPr>
+        <w:rFonts w:ascii="Wingdings" w:hAnsi="Wingdings" w:hint="default"/>
+        <w:sz w:val="20"/>
+      </w:rPr>
+    </w:lvl>
+    <w:lvl w:ilvl="6" w:tentative="1">
+      <w:start w:val="1"/>
+      <w:numFmt w:val="bullet"/>
+      <w:lvlText w:val=""/>
+      <w:lvlJc w:val="left"/>
+      <w:pPr>
+        <w:tabs>
+          <w:tab w:val="num" w:pos="5040"/>
+        </w:tabs>
+        <w:ind w:left="5040" w:hanging="360"/>
+      </w:pPr>
+      <w:rPr>
+        <w:rFonts w:ascii="Wingdings" w:hAnsi="Wingdings" w:hint="default"/>
+        <w:sz w:val="20"/>
+      </w:rPr>
+    </w:lvl>
+    <w:lvl w:ilvl="7" w:tentative="1">
+      <w:start w:val="1"/>
+      <w:numFmt w:val="bullet"/>
+      <w:lvlText w:val=""/>
+      <w:lvlJc w:val="left"/>
+      <w:pPr>
+        <w:tabs>
+          <w:tab w:val="num" w:pos="5760"/>
+        </w:tabs>
+        <w:ind w:left="5760" w:hanging="360"/>
+      </w:pPr>
+      <w:rPr>
+        <w:rFonts w:ascii="Wingdings" w:hAnsi="Wingdings" w:hint="default"/>
+        <w:sz w:val="20"/>
+      </w:rPr>
+    </w:lvl>
+    <w:lvl w:ilvl="8" w:tentative="1">
+      <w:start w:val="1"/>
+      <w:numFmt w:val="bullet"/>
+      <w:lvlText w:val=""/>
+      <w:lvlJc w:val="left"/>
+      <w:pPr>
+        <w:tabs>
+          <w:tab w:val="num" w:pos="6480"/>
+        </w:tabs>
+        <w:ind w:left="6480" w:hanging="360"/>
+      </w:pPr>
+      <w:rPr>
+        <w:rFonts w:ascii="Wingdings" w:hAnsi="Wingdings" w:hint="default"/>
+        <w:sz w:val="20"/>
+      </w:rPr>
+    </w:lvl>
+  </w:abstractNum>
+  <w:abstractNum w:abstractNumId="61" w15:restartNumberingAfterBreak="0">
     <w:nsid w:val="4FB34F1D"/>
     <w:multiLevelType w:val="multilevel"/>
     <w:tmpl w:val="9668B240"/>
@@ -10406,7 +12971,7 @@
       </w:rPr>
     </w:lvl>
   </w:abstractNum>
-  <w:abstractNum w:abstractNumId="49" w15:restartNumberingAfterBreak="0">
+  <w:abstractNum w:abstractNumId="62" w15:restartNumberingAfterBreak="0">
     <w:nsid w:val="514F015C"/>
     <w:multiLevelType w:val="multilevel"/>
     <w:tmpl w:val="926CCB18"/>
@@ -10555,7 +13120,7 @@
       </w:rPr>
     </w:lvl>
   </w:abstractNum>
-  <w:abstractNum w:abstractNumId="50" w15:restartNumberingAfterBreak="0">
+  <w:abstractNum w:abstractNumId="63" w15:restartNumberingAfterBreak="0">
     <w:nsid w:val="534538D4"/>
     <w:multiLevelType w:val="multilevel"/>
     <w:tmpl w:val="9A3685A0"/>
@@ -10704,7 +13269,7 @@
       </w:rPr>
     </w:lvl>
   </w:abstractNum>
-  <w:abstractNum w:abstractNumId="51" w15:restartNumberingAfterBreak="0">
+  <w:abstractNum w:abstractNumId="64" w15:restartNumberingAfterBreak="0">
     <w:nsid w:val="53635304"/>
     <w:multiLevelType w:val="multilevel"/>
     <w:tmpl w:val="323A3072"/>
@@ -10853,7 +13418,7 @@
       </w:rPr>
     </w:lvl>
   </w:abstractNum>
-  <w:abstractNum w:abstractNumId="52" w15:restartNumberingAfterBreak="0">
+  <w:abstractNum w:abstractNumId="65" w15:restartNumberingAfterBreak="0">
     <w:nsid w:val="543E1FA3"/>
     <w:multiLevelType w:val="multilevel"/>
     <w:tmpl w:val="E07ED1EC"/>
@@ -11002,7 +13567,7 @@
       </w:rPr>
     </w:lvl>
   </w:abstractNum>
-  <w:abstractNum w:abstractNumId="53" w15:restartNumberingAfterBreak="0">
+  <w:abstractNum w:abstractNumId="66" w15:restartNumberingAfterBreak="0">
     <w:nsid w:val="55490FBB"/>
     <w:multiLevelType w:val="multilevel"/>
     <w:tmpl w:val="3FBED6B8"/>
@@ -11151,7 +13716,156 @@
       </w:rPr>
     </w:lvl>
   </w:abstractNum>
-  <w:abstractNum w:abstractNumId="54" w15:restartNumberingAfterBreak="0">
+  <w:abstractNum w:abstractNumId="67" w15:restartNumberingAfterBreak="0">
+    <w:nsid w:val="55BC4790"/>
+    <w:multiLevelType w:val="multilevel"/>
+    <w:tmpl w:val="275EB43E"/>
+    <w:lvl w:ilvl="0">
+      <w:start w:val="1"/>
+      <w:numFmt w:val="bullet"/>
+      <w:lvlText w:val=""/>
+      <w:lvlJc w:val="left"/>
+      <w:pPr>
+        <w:tabs>
+          <w:tab w:val="num" w:pos="720"/>
+        </w:tabs>
+        <w:ind w:left="720" w:hanging="360"/>
+      </w:pPr>
+      <w:rPr>
+        <w:rFonts w:ascii="Symbol" w:hAnsi="Symbol" w:hint="default"/>
+        <w:sz w:val="20"/>
+      </w:rPr>
+    </w:lvl>
+    <w:lvl w:ilvl="1" w:tentative="1">
+      <w:start w:val="1"/>
+      <w:numFmt w:val="bullet"/>
+      <w:lvlText w:val="o"/>
+      <w:lvlJc w:val="left"/>
+      <w:pPr>
+        <w:tabs>
+          <w:tab w:val="num" w:pos="1440"/>
+        </w:tabs>
+        <w:ind w:left="1440" w:hanging="360"/>
+      </w:pPr>
+      <w:rPr>
+        <w:rFonts w:ascii="Courier New" w:hAnsi="Courier New" w:hint="default"/>
+        <w:sz w:val="20"/>
+      </w:rPr>
+    </w:lvl>
+    <w:lvl w:ilvl="2" w:tentative="1">
+      <w:start w:val="1"/>
+      <w:numFmt w:val="bullet"/>
+      <w:lvlText w:val=""/>
+      <w:lvlJc w:val="left"/>
+      <w:pPr>
+        <w:tabs>
+          <w:tab w:val="num" w:pos="2160"/>
+        </w:tabs>
+        <w:ind w:left="2160" w:hanging="360"/>
+      </w:pPr>
+      <w:rPr>
+        <w:rFonts w:ascii="Wingdings" w:hAnsi="Wingdings" w:hint="default"/>
+        <w:sz w:val="20"/>
+      </w:rPr>
+    </w:lvl>
+    <w:lvl w:ilvl="3" w:tentative="1">
+      <w:start w:val="1"/>
+      <w:numFmt w:val="bullet"/>
+      <w:lvlText w:val=""/>
+      <w:lvlJc w:val="left"/>
+      <w:pPr>
+        <w:tabs>
+          <w:tab w:val="num" w:pos="2880"/>
+        </w:tabs>
+        <w:ind w:left="2880" w:hanging="360"/>
+      </w:pPr>
+      <w:rPr>
+        <w:rFonts w:ascii="Wingdings" w:hAnsi="Wingdings" w:hint="default"/>
+        <w:sz w:val="20"/>
+      </w:rPr>
+    </w:lvl>
+    <w:lvl w:ilvl="4" w:tentative="1">
+      <w:start w:val="1"/>
+      <w:numFmt w:val="bullet"/>
+      <w:lvlText w:val=""/>
+      <w:lvlJc w:val="left"/>
+      <w:pPr>
+        <w:tabs>
+          <w:tab w:val="num" w:pos="3600"/>
+        </w:tabs>
+        <w:ind w:left="3600" w:hanging="360"/>
+      </w:pPr>
+      <w:rPr>
+        <w:rFonts w:ascii="Wingdings" w:hAnsi="Wingdings" w:hint="default"/>
+        <w:sz w:val="20"/>
+      </w:rPr>
+    </w:lvl>
+    <w:lvl w:ilvl="5" w:tentative="1">
+      <w:start w:val="1"/>
+      <w:numFmt w:val="bullet"/>
+      <w:lvlText w:val=""/>
+      <w:lvlJc w:val="left"/>
+      <w:pPr>
+        <w:tabs>
+          <w:tab w:val="num" w:pos="4320"/>
+        </w:tabs>
+        <w:ind w:left="4320" w:hanging="360"/>
+      </w:pPr>
+      <w:rPr>
+        <w:rFonts w:ascii="Wingdings" w:hAnsi="Wingdings" w:hint="default"/>
+        <w:sz w:val="20"/>
+      </w:rPr>
+    </w:lvl>
+    <w:lvl w:ilvl="6" w:tentative="1">
+      <w:start w:val="1"/>
+      <w:numFmt w:val="bullet"/>
+      <w:lvlText w:val=""/>
+      <w:lvlJc w:val="left"/>
+      <w:pPr>
+        <w:tabs>
+          <w:tab w:val="num" w:pos="5040"/>
+        </w:tabs>
+        <w:ind w:left="5040" w:hanging="360"/>
+      </w:pPr>
+      <w:rPr>
+        <w:rFonts w:ascii="Wingdings" w:hAnsi="Wingdings" w:hint="default"/>
+        <w:sz w:val="20"/>
+      </w:rPr>
+    </w:lvl>
+    <w:lvl w:ilvl="7" w:tentative="1">
+      <w:start w:val="1"/>
+      <w:numFmt w:val="bullet"/>
+      <w:lvlText w:val=""/>
+      <w:lvlJc w:val="left"/>
+      <w:pPr>
+        <w:tabs>
+          <w:tab w:val="num" w:pos="5760"/>
+        </w:tabs>
+        <w:ind w:left="5760" w:hanging="360"/>
+      </w:pPr>
+      <w:rPr>
+        <w:rFonts w:ascii="Wingdings" w:hAnsi="Wingdings" w:hint="default"/>
+        <w:sz w:val="20"/>
+      </w:rPr>
+    </w:lvl>
+    <w:lvl w:ilvl="8" w:tentative="1">
+      <w:start w:val="1"/>
+      <w:numFmt w:val="bullet"/>
+      <w:lvlText w:val=""/>
+      <w:lvlJc w:val="left"/>
+      <w:pPr>
+        <w:tabs>
+          <w:tab w:val="num" w:pos="6480"/>
+        </w:tabs>
+        <w:ind w:left="6480" w:hanging="360"/>
+      </w:pPr>
+      <w:rPr>
+        <w:rFonts w:ascii="Wingdings" w:hAnsi="Wingdings" w:hint="default"/>
+        <w:sz w:val="20"/>
+      </w:rPr>
+    </w:lvl>
+  </w:abstractNum>
+  <w:abstractNum w:abstractNumId="68" w15:restartNumberingAfterBreak="0">
     <w:nsid w:val="570C314D"/>
     <w:multiLevelType w:val="multilevel"/>
     <w:tmpl w:val="4CC8107E"/>
@@ -11300,7 +14014,7 @@
       </w:rPr>
     </w:lvl>
   </w:abstractNum>
-  <w:abstractNum w:abstractNumId="55" w15:restartNumberingAfterBreak="0">
+  <w:abstractNum w:abstractNumId="69" w15:restartNumberingAfterBreak="0">
     <w:nsid w:val="57646513"/>
     <w:multiLevelType w:val="multilevel"/>
     <w:tmpl w:val="A2066C4C"/>
@@ -11449,7 +14163,7 @@
       </w:rPr>
     </w:lvl>
   </w:abstractNum>
-  <w:abstractNum w:abstractNumId="56" w15:restartNumberingAfterBreak="0">
+  <w:abstractNum w:abstractNumId="70" w15:restartNumberingAfterBreak="0">
     <w:nsid w:val="58DB02C4"/>
     <w:multiLevelType w:val="multilevel"/>
     <w:tmpl w:val="8B6642BE"/>
@@ -11598,7 +14312,7 @@
       </w:rPr>
     </w:lvl>
   </w:abstractNum>
-  <w:abstractNum w:abstractNumId="57" w15:restartNumberingAfterBreak="0">
+  <w:abstractNum w:abstractNumId="71" w15:restartNumberingAfterBreak="0">
     <w:nsid w:val="59A02B44"/>
     <w:multiLevelType w:val="multilevel"/>
     <w:tmpl w:val="3A7E69A2"/>
@@ -11747,7 +14461,7 @@
       </w:rPr>
     </w:lvl>
   </w:abstractNum>
-  <w:abstractNum w:abstractNumId="58" w15:restartNumberingAfterBreak="0">
+  <w:abstractNum w:abstractNumId="72" w15:restartNumberingAfterBreak="0">
     <w:nsid w:val="59E15813"/>
     <w:multiLevelType w:val="multilevel"/>
     <w:tmpl w:val="1B669FF6"/>
@@ -11896,7 +14610,7 @@
       </w:rPr>
     </w:lvl>
   </w:abstractNum>
-  <w:abstractNum w:abstractNumId="59" w15:restartNumberingAfterBreak="0">
+  <w:abstractNum w:abstractNumId="73" w15:restartNumberingAfterBreak="0">
     <w:nsid w:val="5E953804"/>
     <w:multiLevelType w:val="multilevel"/>
     <w:tmpl w:val="4224B2D0"/>
@@ -12045,7 +14759,7 @@
       </w:rPr>
     </w:lvl>
   </w:abstractNum>
-  <w:abstractNum w:abstractNumId="60" w15:restartNumberingAfterBreak="0">
+  <w:abstractNum w:abstractNumId="74" w15:restartNumberingAfterBreak="0">
     <w:nsid w:val="5EA36A14"/>
     <w:multiLevelType w:val="multilevel"/>
     <w:tmpl w:val="9EBE4EB4"/>
@@ -12194,7 +14908,156 @@
       </w:rPr>
     </w:lvl>
   </w:abstractNum>
-  <w:abstractNum w:abstractNumId="61" w15:restartNumberingAfterBreak="0">
+  <w:abstractNum w:abstractNumId="75" w15:restartNumberingAfterBreak="0">
+    <w:nsid w:val="605D1ED8"/>
+    <w:multiLevelType w:val="multilevel"/>
+    <w:tmpl w:val="D7D0E85C"/>
+    <w:lvl w:ilvl="0">
+      <w:start w:val="1"/>
+      <w:numFmt w:val="bullet"/>
+      <w:lvlText w:val=""/>
+      <w:lvlJc w:val="left"/>
+      <w:pPr>
+        <w:tabs>
+          <w:tab w:val="num" w:pos="720"/>
+        </w:tabs>
+        <w:ind w:left="720" w:hanging="360"/>
+      </w:pPr>
+      <w:rPr>
+        <w:rFonts w:ascii="Symbol" w:hAnsi="Symbol" w:hint="default"/>
+        <w:sz w:val="20"/>
+      </w:rPr>
+    </w:lvl>
+    <w:lvl w:ilvl="1" w:tentative="1">
+      <w:start w:val="1"/>
+      <w:numFmt w:val="bullet"/>
+      <w:lvlText w:val="o"/>
+      <w:lvlJc w:val="left"/>
+      <w:pPr>
+        <w:tabs>
+          <w:tab w:val="num" w:pos="1440"/>
+        </w:tabs>
+        <w:ind w:left="1440" w:hanging="360"/>
+      </w:pPr>
+      <w:rPr>
+        <w:rFonts w:ascii="Courier New" w:hAnsi="Courier New" w:hint="default"/>
+        <w:sz w:val="20"/>
+      </w:rPr>
+    </w:lvl>
+    <w:lvl w:ilvl="2" w:tentative="1">
+      <w:start w:val="1"/>
+      <w:numFmt w:val="bullet"/>
+      <w:lvlText w:val=""/>
+      <w:lvlJc w:val="left"/>
+      <w:pPr>
+        <w:tabs>
+          <w:tab w:val="num" w:pos="2160"/>
+        </w:tabs>
+        <w:ind w:left="2160" w:hanging="360"/>
+      </w:pPr>
+      <w:rPr>
+        <w:rFonts w:ascii="Wingdings" w:hAnsi="Wingdings" w:hint="default"/>
+        <w:sz w:val="20"/>
+      </w:rPr>
+    </w:lvl>
+    <w:lvl w:ilvl="3" w:tentative="1">
+      <w:start w:val="1"/>
+      <w:numFmt w:val="bullet"/>
+      <w:lvlText w:val=""/>
+      <w:lvlJc w:val="left"/>
+      <w:pPr>
+        <w:tabs>
+          <w:tab w:val="num" w:pos="2880"/>
+        </w:tabs>
+        <w:ind w:left="2880" w:hanging="360"/>
+      </w:pPr>
+      <w:rPr>
+        <w:rFonts w:ascii="Wingdings" w:hAnsi="Wingdings" w:hint="default"/>
+        <w:sz w:val="20"/>
+      </w:rPr>
+    </w:lvl>
+    <w:lvl w:ilvl="4" w:tentative="1">
+      <w:start w:val="1"/>
+      <w:numFmt w:val="bullet"/>
+      <w:lvlText w:val=""/>
+      <w:lvlJc w:val="left"/>
+      <w:pPr>
+        <w:tabs>
+          <w:tab w:val="num" w:pos="3600"/>
+        </w:tabs>
+        <w:ind w:left="3600" w:hanging="360"/>
+      </w:pPr>
+      <w:rPr>
+        <w:rFonts w:ascii="Wingdings" w:hAnsi="Wingdings" w:hint="default"/>
+        <w:sz w:val="20"/>
+      </w:rPr>
+    </w:lvl>
+    <w:lvl w:ilvl="5" w:tentative="1">
+      <w:start w:val="1"/>
+      <w:numFmt w:val="bullet"/>
+      <w:lvlText w:val=""/>
+      <w:lvlJc w:val="left"/>
+      <w:pPr>
+        <w:tabs>
+          <w:tab w:val="num" w:pos="4320"/>
+        </w:tabs>
+        <w:ind w:left="4320" w:hanging="360"/>
+      </w:pPr>
+      <w:rPr>
+        <w:rFonts w:ascii="Wingdings" w:hAnsi="Wingdings" w:hint="default"/>
+        <w:sz w:val="20"/>
+      </w:rPr>
+    </w:lvl>
+    <w:lvl w:ilvl="6" w:tentative="1">
+      <w:start w:val="1"/>
+      <w:numFmt w:val="bullet"/>
+      <w:lvlText w:val=""/>
+      <w:lvlJc w:val="left"/>
+      <w:pPr>
+        <w:tabs>
+          <w:tab w:val="num" w:pos="5040"/>
+        </w:tabs>
+        <w:ind w:left="5040" w:hanging="360"/>
+      </w:pPr>
+      <w:rPr>
+        <w:rFonts w:ascii="Wingdings" w:hAnsi="Wingdings" w:hint="default"/>
+        <w:sz w:val="20"/>
+      </w:rPr>
+    </w:lvl>
+    <w:lvl w:ilvl="7" w:tentative="1">
+      <w:start w:val="1"/>
+      <w:numFmt w:val="bullet"/>
+      <w:lvlText w:val=""/>
+      <w:lvlJc w:val="left"/>
+      <w:pPr>
+        <w:tabs>
+          <w:tab w:val="num" w:pos="5760"/>
+        </w:tabs>
+        <w:ind w:left="5760" w:hanging="360"/>
+      </w:pPr>
+      <w:rPr>
+        <w:rFonts w:ascii="Wingdings" w:hAnsi="Wingdings" w:hint="default"/>
+        <w:sz w:val="20"/>
+      </w:rPr>
+    </w:lvl>
+    <w:lvl w:ilvl="8" w:tentative="1">
+      <w:start w:val="1"/>
+      <w:numFmt w:val="bullet"/>
+      <w:lvlText w:val=""/>
+      <w:lvlJc w:val="left"/>
+      <w:pPr>
+        <w:tabs>
+          <w:tab w:val="num" w:pos="6480"/>
+        </w:tabs>
+        <w:ind w:left="6480" w:hanging="360"/>
+      </w:pPr>
+      <w:rPr>
+        <w:rFonts w:ascii="Wingdings" w:hAnsi="Wingdings" w:hint="default"/>
+        <w:sz w:val="20"/>
+      </w:rPr>
+    </w:lvl>
+  </w:abstractNum>
+  <w:abstractNum w:abstractNumId="76" w15:restartNumberingAfterBreak="0">
     <w:nsid w:val="60946A20"/>
     <w:multiLevelType w:val="multilevel"/>
     <w:tmpl w:val="46441D14"/>
@@ -12343,7 +15206,7 @@
       </w:rPr>
     </w:lvl>
   </w:abstractNum>
-  <w:abstractNum w:abstractNumId="62" w15:restartNumberingAfterBreak="0">
+  <w:abstractNum w:abstractNumId="77" w15:restartNumberingAfterBreak="0">
     <w:nsid w:val="60CF3C26"/>
     <w:multiLevelType w:val="multilevel"/>
     <w:tmpl w:val="69207982"/>
@@ -12492,7 +15355,7 @@
       </w:rPr>
     </w:lvl>
   </w:abstractNum>
-  <w:abstractNum w:abstractNumId="63" w15:restartNumberingAfterBreak="0">
+  <w:abstractNum w:abstractNumId="78" w15:restartNumberingAfterBreak="0">
     <w:nsid w:val="642D5BE3"/>
     <w:multiLevelType w:val="multilevel"/>
     <w:tmpl w:val="D73A8BC6"/>
@@ -12641,7 +15504,7 @@
       </w:rPr>
     </w:lvl>
   </w:abstractNum>
-  <w:abstractNum w:abstractNumId="64" w15:restartNumberingAfterBreak="0">
+  <w:abstractNum w:abstractNumId="79" w15:restartNumberingAfterBreak="0">
     <w:nsid w:val="644E5853"/>
     <w:multiLevelType w:val="multilevel"/>
     <w:tmpl w:val="582AC934"/>
@@ -12790,7 +15653,7 @@
       </w:rPr>
     </w:lvl>
   </w:abstractNum>
-  <w:abstractNum w:abstractNumId="65" w15:restartNumberingAfterBreak="0">
+  <w:abstractNum w:abstractNumId="80" w15:restartNumberingAfterBreak="0">
     <w:nsid w:val="660C1473"/>
     <w:multiLevelType w:val="multilevel"/>
     <w:tmpl w:val="45F0807A"/>
@@ -12939,7 +15802,7 @@
       </w:rPr>
     </w:lvl>
   </w:abstractNum>
-  <w:abstractNum w:abstractNumId="66" w15:restartNumberingAfterBreak="0">
+  <w:abstractNum w:abstractNumId="81" w15:restartNumberingAfterBreak="0">
     <w:nsid w:val="66F34E4B"/>
     <w:multiLevelType w:val="multilevel"/>
     <w:tmpl w:val="A852D55E"/>
@@ -13088,7 +15951,7 @@
       </w:rPr>
     </w:lvl>
   </w:abstractNum>
-  <w:abstractNum w:abstractNumId="67" w15:restartNumberingAfterBreak="0">
+  <w:abstractNum w:abstractNumId="82" w15:restartNumberingAfterBreak="0">
     <w:nsid w:val="673F3B91"/>
     <w:multiLevelType w:val="multilevel"/>
     <w:tmpl w:val="DA7EBF18"/>
@@ -13237,7 +16100,7 @@
       </w:rPr>
     </w:lvl>
   </w:abstractNum>
-  <w:abstractNum w:abstractNumId="68" w15:restartNumberingAfterBreak="0">
+  <w:abstractNum w:abstractNumId="83" w15:restartNumberingAfterBreak="0">
     <w:nsid w:val="67434D8F"/>
     <w:multiLevelType w:val="multilevel"/>
     <w:tmpl w:val="5030AA6C"/>
@@ -13386,7 +16249,7 @@
       </w:rPr>
     </w:lvl>
   </w:abstractNum>
-  <w:abstractNum w:abstractNumId="69" w15:restartNumberingAfterBreak="0">
+  <w:abstractNum w:abstractNumId="84" w15:restartNumberingAfterBreak="0">
     <w:nsid w:val="6753271E"/>
     <w:multiLevelType w:val="multilevel"/>
     <w:tmpl w:val="DE88A0E6"/>
@@ -13535,7 +16398,7 @@
       </w:rPr>
     </w:lvl>
   </w:abstractNum>
-  <w:abstractNum w:abstractNumId="70" w15:restartNumberingAfterBreak="0">
+  <w:abstractNum w:abstractNumId="85" w15:restartNumberingAfterBreak="0">
     <w:nsid w:val="68EB457D"/>
     <w:multiLevelType w:val="multilevel"/>
     <w:tmpl w:val="2770651C"/>
@@ -13684,7 +16547,7 @@
       </w:rPr>
     </w:lvl>
   </w:abstractNum>
-  <w:abstractNum w:abstractNumId="71" w15:restartNumberingAfterBreak="0">
+  <w:abstractNum w:abstractNumId="86" w15:restartNumberingAfterBreak="0">
     <w:nsid w:val="69007F77"/>
     <w:multiLevelType w:val="multilevel"/>
     <w:tmpl w:val="8F32F9D0"/>
@@ -13833,7 +16696,156 @@
       </w:rPr>
     </w:lvl>
   </w:abstractNum>
-  <w:abstractNum w:abstractNumId="72" w15:restartNumberingAfterBreak="0">
+  <w:abstractNum w:abstractNumId="87" w15:restartNumberingAfterBreak="0">
+    <w:nsid w:val="69582D9E"/>
+    <w:multiLevelType w:val="multilevel"/>
+    <w:tmpl w:val="6D78EC10"/>
+    <w:lvl w:ilvl="0">
+      <w:start w:val="1"/>
+      <w:numFmt w:val="bullet"/>
+      <w:lvlText w:val=""/>
+      <w:lvlJc w:val="left"/>
+      <w:pPr>
+        <w:tabs>
+          <w:tab w:val="num" w:pos="720"/>
+        </w:tabs>
+        <w:ind w:left="720" w:hanging="360"/>
+      </w:pPr>
+      <w:rPr>
+        <w:rFonts w:ascii="Symbol" w:hAnsi="Symbol" w:hint="default"/>
+        <w:sz w:val="20"/>
+      </w:rPr>
+    </w:lvl>
+    <w:lvl w:ilvl="1" w:tentative="1">
+      <w:start w:val="1"/>
+      <w:numFmt w:val="bullet"/>
+      <w:lvlText w:val="o"/>
+      <w:lvlJc w:val="left"/>
+      <w:pPr>
+        <w:tabs>
+          <w:tab w:val="num" w:pos="1440"/>
+        </w:tabs>
+        <w:ind w:left="1440" w:hanging="360"/>
+      </w:pPr>
+      <w:rPr>
+        <w:rFonts w:ascii="Courier New" w:hAnsi="Courier New" w:hint="default"/>
+        <w:sz w:val="20"/>
+      </w:rPr>
+    </w:lvl>
+    <w:lvl w:ilvl="2" w:tentative="1">
+      <w:start w:val="1"/>
+      <w:numFmt w:val="bullet"/>
+      <w:lvlText w:val=""/>
+      <w:lvlJc w:val="left"/>
+      <w:pPr>
+        <w:tabs>
+          <w:tab w:val="num" w:pos="2160"/>
+        </w:tabs>
+        <w:ind w:left="2160" w:hanging="360"/>
+      </w:pPr>
+      <w:rPr>
+        <w:rFonts w:ascii="Wingdings" w:hAnsi="Wingdings" w:hint="default"/>
+        <w:sz w:val="20"/>
+      </w:rPr>
+    </w:lvl>
+    <w:lvl w:ilvl="3" w:tentative="1">
+      <w:start w:val="1"/>
+      <w:numFmt w:val="bullet"/>
+      <w:lvlText w:val=""/>
+      <w:lvlJc w:val="left"/>
+      <w:pPr>
+        <w:tabs>
+          <w:tab w:val="num" w:pos="2880"/>
+        </w:tabs>
+        <w:ind w:left="2880" w:hanging="360"/>
+      </w:pPr>
+      <w:rPr>
+        <w:rFonts w:ascii="Wingdings" w:hAnsi="Wingdings" w:hint="default"/>
+        <w:sz w:val="20"/>
+      </w:rPr>
+    </w:lvl>
+    <w:lvl w:ilvl="4" w:tentative="1">
+      <w:start w:val="1"/>
+      <w:numFmt w:val="bullet"/>
+      <w:lvlText w:val=""/>
+      <w:lvlJc w:val="left"/>
+      <w:pPr>
+        <w:tabs>
+          <w:tab w:val="num" w:pos="3600"/>
+        </w:tabs>
+        <w:ind w:left="3600" w:hanging="360"/>
+      </w:pPr>
+      <w:rPr>
+        <w:rFonts w:ascii="Wingdings" w:hAnsi="Wingdings" w:hint="default"/>
+        <w:sz w:val="20"/>
+      </w:rPr>
+    </w:lvl>
+    <w:lvl w:ilvl="5" w:tentative="1">
+      <w:start w:val="1"/>
+      <w:numFmt w:val="bullet"/>
+      <w:lvlText w:val=""/>
+      <w:lvlJc w:val="left"/>
+      <w:pPr>
+        <w:tabs>
+          <w:tab w:val="num" w:pos="4320"/>
+        </w:tabs>
+        <w:ind w:left="4320" w:hanging="360"/>
+      </w:pPr>
+      <w:rPr>
+        <w:rFonts w:ascii="Wingdings" w:hAnsi="Wingdings" w:hint="default"/>
+        <w:sz w:val="20"/>
+      </w:rPr>
+    </w:lvl>
+    <w:lvl w:ilvl="6" w:tentative="1">
+      <w:start w:val="1"/>
+      <w:numFmt w:val="bullet"/>
+      <w:lvlText w:val=""/>
+      <w:lvlJc w:val="left"/>
+      <w:pPr>
+        <w:tabs>
+          <w:tab w:val="num" w:pos="5040"/>
+        </w:tabs>
+        <w:ind w:left="5040" w:hanging="360"/>
+      </w:pPr>
+      <w:rPr>
+        <w:rFonts w:ascii="Wingdings" w:hAnsi="Wingdings" w:hint="default"/>
+        <w:sz w:val="20"/>
+      </w:rPr>
+    </w:lvl>
+    <w:lvl w:ilvl="7" w:tentative="1">
+      <w:start w:val="1"/>
+      <w:numFmt w:val="bullet"/>
+      <w:lvlText w:val=""/>
+      <w:lvlJc w:val="left"/>
+      <w:pPr>
+        <w:tabs>
+          <w:tab w:val="num" w:pos="5760"/>
+        </w:tabs>
+        <w:ind w:left="5760" w:hanging="360"/>
+      </w:pPr>
+      <w:rPr>
+        <w:rFonts w:ascii="Wingdings" w:hAnsi="Wingdings" w:hint="default"/>
+        <w:sz w:val="20"/>
+      </w:rPr>
+    </w:lvl>
+    <w:lvl w:ilvl="8" w:tentative="1">
+      <w:start w:val="1"/>
+      <w:numFmt w:val="bullet"/>
+      <w:lvlText w:val=""/>
+      <w:lvlJc w:val="left"/>
+      <w:pPr>
+        <w:tabs>
+          <w:tab w:val="num" w:pos="6480"/>
+        </w:tabs>
+        <w:ind w:left="6480" w:hanging="360"/>
+      </w:pPr>
+      <w:rPr>
+        <w:rFonts w:ascii="Wingdings" w:hAnsi="Wingdings" w:hint="default"/>
+        <w:sz w:val="20"/>
+      </w:rPr>
+    </w:lvl>
+  </w:abstractNum>
+  <w:abstractNum w:abstractNumId="88" w15:restartNumberingAfterBreak="0">
     <w:nsid w:val="6B7D6F16"/>
     <w:multiLevelType w:val="multilevel"/>
     <w:tmpl w:val="C636890C"/>
@@ -13982,7 +16994,7 @@
       </w:rPr>
     </w:lvl>
   </w:abstractNum>
-  <w:abstractNum w:abstractNumId="73" w15:restartNumberingAfterBreak="0">
+  <w:abstractNum w:abstractNumId="89" w15:restartNumberingAfterBreak="0">
     <w:nsid w:val="6C106A01"/>
     <w:multiLevelType w:val="multilevel"/>
     <w:tmpl w:val="E49A6CD6"/>
@@ -14131,7 +17143,7 @@
       </w:rPr>
     </w:lvl>
   </w:abstractNum>
-  <w:abstractNum w:abstractNumId="74" w15:restartNumberingAfterBreak="0">
+  <w:abstractNum w:abstractNumId="90" w15:restartNumberingAfterBreak="0">
     <w:nsid w:val="6C890486"/>
     <w:multiLevelType w:val="multilevel"/>
     <w:tmpl w:val="5B042AA2"/>
@@ -14280,7 +17292,7 @@
       </w:rPr>
     </w:lvl>
   </w:abstractNum>
-  <w:abstractNum w:abstractNumId="75" w15:restartNumberingAfterBreak="0">
+  <w:abstractNum w:abstractNumId="91" w15:restartNumberingAfterBreak="0">
     <w:nsid w:val="6E755F8C"/>
     <w:multiLevelType w:val="multilevel"/>
     <w:tmpl w:val="AC0496C0"/>
@@ -14429,7 +17441,7 @@
       </w:rPr>
     </w:lvl>
   </w:abstractNum>
-  <w:abstractNum w:abstractNumId="76" w15:restartNumberingAfterBreak="0">
+  <w:abstractNum w:abstractNumId="92" w15:restartNumberingAfterBreak="0">
     <w:nsid w:val="6EFC1427"/>
     <w:multiLevelType w:val="multilevel"/>
     <w:tmpl w:val="8D789F54"/>
@@ -14578,7 +17590,305 @@
       </w:rPr>
     </w:lvl>
   </w:abstractNum>
-  <w:abstractNum w:abstractNumId="77" w15:restartNumberingAfterBreak="0">
+  <w:abstractNum w:abstractNumId="93" w15:restartNumberingAfterBreak="0">
+    <w:nsid w:val="6FA56894"/>
+    <w:multiLevelType w:val="multilevel"/>
+    <w:tmpl w:val="6F6E3F18"/>
+    <w:lvl w:ilvl="0">
+      <w:start w:val="1"/>
+      <w:numFmt w:val="bullet"/>
+      <w:lvlText w:val=""/>
+      <w:lvlJc w:val="left"/>
+      <w:pPr>
+        <w:tabs>
+          <w:tab w:val="num" w:pos="720"/>
+        </w:tabs>
+        <w:ind w:left="720" w:hanging="360"/>
+      </w:pPr>
+      <w:rPr>
+        <w:rFonts w:ascii="Symbol" w:hAnsi="Symbol" w:hint="default"/>
+        <w:sz w:val="20"/>
+      </w:rPr>
+    </w:lvl>
+    <w:lvl w:ilvl="1" w:tentative="1">
+      <w:start w:val="1"/>
+      <w:numFmt w:val="bullet"/>
+      <w:lvlText w:val="o"/>
+      <w:lvlJc w:val="left"/>
+      <w:pPr>
+        <w:tabs>
+          <w:tab w:val="num" w:pos="1440"/>
+        </w:tabs>
+        <w:ind w:left="1440" w:hanging="360"/>
+      </w:pPr>
+      <w:rPr>
+        <w:rFonts w:ascii="Courier New" w:hAnsi="Courier New" w:hint="default"/>
+        <w:sz w:val="20"/>
+      </w:rPr>
+    </w:lvl>
+    <w:lvl w:ilvl="2" w:tentative="1">
+      <w:start w:val="1"/>
+      <w:numFmt w:val="bullet"/>
+      <w:lvlText w:val=""/>
+      <w:lvlJc w:val="left"/>
+      <w:pPr>
+        <w:tabs>
+          <w:tab w:val="num" w:pos="2160"/>
+        </w:tabs>
+        <w:ind w:left="2160" w:hanging="360"/>
+      </w:pPr>
+      <w:rPr>
+        <w:rFonts w:ascii="Wingdings" w:hAnsi="Wingdings" w:hint="default"/>
+        <w:sz w:val="20"/>
+      </w:rPr>
+    </w:lvl>
+    <w:lvl w:ilvl="3" w:tentative="1">
+      <w:start w:val="1"/>
+      <w:numFmt w:val="bullet"/>
+      <w:lvlText w:val=""/>
+      <w:lvlJc w:val="left"/>
+      <w:pPr>
+        <w:tabs>
+          <w:tab w:val="num" w:pos="2880"/>
+        </w:tabs>
+        <w:ind w:left="2880" w:hanging="360"/>
+      </w:pPr>
+      <w:rPr>
+        <w:rFonts w:ascii="Wingdings" w:hAnsi="Wingdings" w:hint="default"/>
+        <w:sz w:val="20"/>
+      </w:rPr>
+    </w:lvl>
+    <w:lvl w:ilvl="4" w:tentative="1">
+      <w:start w:val="1"/>
+      <w:numFmt w:val="bullet"/>
+      <w:lvlText w:val=""/>
+      <w:lvlJc w:val="left"/>
+      <w:pPr>
+        <w:tabs>
+          <w:tab w:val="num" w:pos="3600"/>
+        </w:tabs>
+        <w:ind w:left="3600" w:hanging="360"/>
+      </w:pPr>
+      <w:rPr>
+        <w:rFonts w:ascii="Wingdings" w:hAnsi="Wingdings" w:hint="default"/>
+        <w:sz w:val="20"/>
+      </w:rPr>
+    </w:lvl>
+    <w:lvl w:ilvl="5" w:tentative="1">
+      <w:start w:val="1"/>
+      <w:numFmt w:val="bullet"/>
+      <w:lvlText w:val=""/>
+      <w:lvlJc w:val="left"/>
+      <w:pPr>
+        <w:tabs>
+          <w:tab w:val="num" w:pos="4320"/>
+        </w:tabs>
+        <w:ind w:left="4320" w:hanging="360"/>
+      </w:pPr>
+      <w:rPr>
+        <w:rFonts w:ascii="Wingdings" w:hAnsi="Wingdings" w:hint="default"/>
+        <w:sz w:val="20"/>
+      </w:rPr>
+    </w:lvl>
+    <w:lvl w:ilvl="6" w:tentative="1">
+      <w:start w:val="1"/>
+      <w:numFmt w:val="bullet"/>
+      <w:lvlText w:val=""/>
+      <w:lvlJc w:val="left"/>
+      <w:pPr>
+        <w:tabs>
+          <w:tab w:val="num" w:pos="5040"/>
+        </w:tabs>
+        <w:ind w:left="5040" w:hanging="360"/>
+      </w:pPr>
+      <w:rPr>
+        <w:rFonts w:ascii="Wingdings" w:hAnsi="Wingdings" w:hint="default"/>
+        <w:sz w:val="20"/>
+      </w:rPr>
+    </w:lvl>
+    <w:lvl w:ilvl="7" w:tentative="1">
+      <w:start w:val="1"/>
+      <w:numFmt w:val="bullet"/>
+      <w:lvlText w:val=""/>
+      <w:lvlJc w:val="left"/>
+      <w:pPr>
+        <w:tabs>
+          <w:tab w:val="num" w:pos="5760"/>
+        </w:tabs>
+        <w:ind w:left="5760" w:hanging="360"/>
+      </w:pPr>
+      <w:rPr>
+        <w:rFonts w:ascii="Wingdings" w:hAnsi="Wingdings" w:hint="default"/>
+        <w:sz w:val="20"/>
+      </w:rPr>
+    </w:lvl>
+    <w:lvl w:ilvl="8" w:tentative="1">
+      <w:start w:val="1"/>
+      <w:numFmt w:val="bullet"/>
+      <w:lvlText w:val=""/>
+      <w:lvlJc w:val="left"/>
+      <w:pPr>
+        <w:tabs>
+          <w:tab w:val="num" w:pos="6480"/>
+        </w:tabs>
+        <w:ind w:left="6480" w:hanging="360"/>
+      </w:pPr>
+      <w:rPr>
+        <w:rFonts w:ascii="Wingdings" w:hAnsi="Wingdings" w:hint="default"/>
+        <w:sz w:val="20"/>
+      </w:rPr>
+    </w:lvl>
+  </w:abstractNum>
+  <w:abstractNum w:abstractNumId="94" w15:restartNumberingAfterBreak="0">
+    <w:nsid w:val="71011071"/>
+    <w:multiLevelType w:val="multilevel"/>
+    <w:tmpl w:val="E5AA540E"/>
+    <w:lvl w:ilvl="0">
+      <w:start w:val="1"/>
+      <w:numFmt w:val="bullet"/>
+      <w:lvlText w:val=""/>
+      <w:lvlJc w:val="left"/>
+      <w:pPr>
+        <w:tabs>
+          <w:tab w:val="num" w:pos="720"/>
+        </w:tabs>
+        <w:ind w:left="720" w:hanging="360"/>
+      </w:pPr>
+      <w:rPr>
+        <w:rFonts w:ascii="Symbol" w:hAnsi="Symbol" w:hint="default"/>
+        <w:sz w:val="20"/>
+      </w:rPr>
+    </w:lvl>
+    <w:lvl w:ilvl="1" w:tentative="1">
+      <w:start w:val="1"/>
+      <w:numFmt w:val="bullet"/>
+      <w:lvlText w:val="o"/>
+      <w:lvlJc w:val="left"/>
+      <w:pPr>
+        <w:tabs>
+          <w:tab w:val="num" w:pos="1440"/>
+        </w:tabs>
+        <w:ind w:left="1440" w:hanging="360"/>
+      </w:pPr>
+      <w:rPr>
+        <w:rFonts w:ascii="Courier New" w:hAnsi="Courier New" w:hint="default"/>
+        <w:sz w:val="20"/>
+      </w:rPr>
+    </w:lvl>
+    <w:lvl w:ilvl="2" w:tentative="1">
+      <w:start w:val="1"/>
+      <w:numFmt w:val="bullet"/>
+      <w:lvlText w:val=""/>
+      <w:lvlJc w:val="left"/>
+      <w:pPr>
+        <w:tabs>
+          <w:tab w:val="num" w:pos="2160"/>
+        </w:tabs>
+        <w:ind w:left="2160" w:hanging="360"/>
+      </w:pPr>
+      <w:rPr>
+        <w:rFonts w:ascii="Wingdings" w:hAnsi="Wingdings" w:hint="default"/>
+        <w:sz w:val="20"/>
+      </w:rPr>
+    </w:lvl>
+    <w:lvl w:ilvl="3" w:tentative="1">
+      <w:start w:val="1"/>
+      <w:numFmt w:val="bullet"/>
+      <w:lvlText w:val=""/>
+      <w:lvlJc w:val="left"/>
+      <w:pPr>
+        <w:tabs>
+          <w:tab w:val="num" w:pos="2880"/>
+        </w:tabs>
+        <w:ind w:left="2880" w:hanging="360"/>
+      </w:pPr>
+      <w:rPr>
+        <w:rFonts w:ascii="Wingdings" w:hAnsi="Wingdings" w:hint="default"/>
+        <w:sz w:val="20"/>
+      </w:rPr>
+    </w:lvl>
+    <w:lvl w:ilvl="4" w:tentative="1">
+      <w:start w:val="1"/>
+      <w:numFmt w:val="bullet"/>
+      <w:lvlText w:val=""/>
+      <w:lvlJc w:val="left"/>
+      <w:pPr>
+        <w:tabs>
+          <w:tab w:val="num" w:pos="3600"/>
+        </w:tabs>
+        <w:ind w:left="3600" w:hanging="360"/>
+      </w:pPr>
+      <w:rPr>
+        <w:rFonts w:ascii="Wingdings" w:hAnsi="Wingdings" w:hint="default"/>
+        <w:sz w:val="20"/>
+      </w:rPr>
+    </w:lvl>
+    <w:lvl w:ilvl="5" w:tentative="1">
+      <w:start w:val="1"/>
+      <w:numFmt w:val="bullet"/>
+      <w:lvlText w:val=""/>
+      <w:lvlJc w:val="left"/>
+      <w:pPr>
+        <w:tabs>
+          <w:tab w:val="num" w:pos="4320"/>
+        </w:tabs>
+        <w:ind w:left="4320" w:hanging="360"/>
+      </w:pPr>
+      <w:rPr>
+        <w:rFonts w:ascii="Wingdings" w:hAnsi="Wingdings" w:hint="default"/>
+        <w:sz w:val="20"/>
+      </w:rPr>
+    </w:lvl>
+    <w:lvl w:ilvl="6" w:tentative="1">
+      <w:start w:val="1"/>
+      <w:numFmt w:val="bullet"/>
+      <w:lvlText w:val=""/>
+      <w:lvlJc w:val="left"/>
+      <w:pPr>
+        <w:tabs>
+          <w:tab w:val="num" w:pos="5040"/>
+        </w:tabs>
+        <w:ind w:left="5040" w:hanging="360"/>
+      </w:pPr>
+      <w:rPr>
+        <w:rFonts w:ascii="Wingdings" w:hAnsi="Wingdings" w:hint="default"/>
+        <w:sz w:val="20"/>
+      </w:rPr>
+    </w:lvl>
+    <w:lvl w:ilvl="7" w:tentative="1">
+      <w:start w:val="1"/>
+      <w:numFmt w:val="bullet"/>
+      <w:lvlText w:val=""/>
+      <w:lvlJc w:val="left"/>
+      <w:pPr>
+        <w:tabs>
+          <w:tab w:val="num" w:pos="5760"/>
+        </w:tabs>
+        <w:ind w:left="5760" w:hanging="360"/>
+      </w:pPr>
+      <w:rPr>
+        <w:rFonts w:ascii="Wingdings" w:hAnsi="Wingdings" w:hint="default"/>
+        <w:sz w:val="20"/>
+      </w:rPr>
+    </w:lvl>
+    <w:lvl w:ilvl="8" w:tentative="1">
+      <w:start w:val="1"/>
+      <w:numFmt w:val="bullet"/>
+      <w:lvlText w:val=""/>
+      <w:lvlJc w:val="left"/>
+      <w:pPr>
+        <w:tabs>
+          <w:tab w:val="num" w:pos="6480"/>
+        </w:tabs>
+        <w:ind w:left="6480" w:hanging="360"/>
+      </w:pPr>
+      <w:rPr>
+        <w:rFonts w:ascii="Wingdings" w:hAnsi="Wingdings" w:hint="default"/>
+        <w:sz w:val="20"/>
+      </w:rPr>
+    </w:lvl>
+  </w:abstractNum>
+  <w:abstractNum w:abstractNumId="95" w15:restartNumberingAfterBreak="0">
     <w:nsid w:val="74A07B50"/>
     <w:multiLevelType w:val="multilevel"/>
     <w:tmpl w:val="10A86156"/>
@@ -14727,7 +18037,7 @@
       </w:rPr>
     </w:lvl>
   </w:abstractNum>
-  <w:abstractNum w:abstractNumId="78" w15:restartNumberingAfterBreak="0">
+  <w:abstractNum w:abstractNumId="96" w15:restartNumberingAfterBreak="0">
     <w:nsid w:val="74B20F3B"/>
     <w:multiLevelType w:val="multilevel"/>
     <w:tmpl w:val="D42C3DFE"/>
@@ -14876,7 +18186,7 @@
       </w:rPr>
     </w:lvl>
   </w:abstractNum>
-  <w:abstractNum w:abstractNumId="79" w15:restartNumberingAfterBreak="0">
+  <w:abstractNum w:abstractNumId="97" w15:restartNumberingAfterBreak="0">
     <w:nsid w:val="79DE7DB2"/>
     <w:multiLevelType w:val="multilevel"/>
     <w:tmpl w:val="E138E0F0"/>
@@ -15025,7 +18335,7 @@
       </w:rPr>
     </w:lvl>
   </w:abstractNum>
-  <w:abstractNum w:abstractNumId="80" w15:restartNumberingAfterBreak="0">
+  <w:abstractNum w:abstractNumId="98" w15:restartNumberingAfterBreak="0">
     <w:nsid w:val="7E444206"/>
     <w:multiLevelType w:val="multilevel"/>
     <w:tmpl w:val="39C46520"/>
@@ -15175,247 +18485,301 @@
     </w:lvl>
   </w:abstractNum>
   <w:num w:numId="1" w16cid:durableId="1448506990">
-    <w:abstractNumId w:val="67"/>
+    <w:abstractNumId w:val="82"/>
   </w:num>
   <w:num w:numId="2" w16cid:durableId="110975286">
+    <w:abstractNumId w:val="42"/>
+  </w:num>
+  <w:num w:numId="3" w16cid:durableId="2008745667">
+    <w:abstractNumId w:val="22"/>
+  </w:num>
+  <w:num w:numId="4" w16cid:durableId="1307508913">
+    <w:abstractNumId w:val="16"/>
+  </w:num>
+  <w:num w:numId="5" w16cid:durableId="1138885569">
+    <w:abstractNumId w:val="40"/>
+  </w:num>
+  <w:num w:numId="6" w16cid:durableId="78719073">
+    <w:abstractNumId w:val="19"/>
+  </w:num>
+  <w:num w:numId="7" w16cid:durableId="128981304">
+    <w:abstractNumId w:val="45"/>
+  </w:num>
+  <w:num w:numId="8" w16cid:durableId="298151013">
+    <w:abstractNumId w:val="27"/>
+  </w:num>
+  <w:num w:numId="9" w16cid:durableId="895629376">
+    <w:abstractNumId w:val="32"/>
+  </w:num>
+  <w:num w:numId="10" w16cid:durableId="90660721">
+    <w:abstractNumId w:val="29"/>
+  </w:num>
+  <w:num w:numId="11" w16cid:durableId="1394623328">
+    <w:abstractNumId w:val="55"/>
+  </w:num>
+  <w:num w:numId="12" w16cid:durableId="1714840833">
+    <w:abstractNumId w:val="96"/>
+  </w:num>
+  <w:num w:numId="13" w16cid:durableId="991055973">
+    <w:abstractNumId w:val="24"/>
+  </w:num>
+  <w:num w:numId="14" w16cid:durableId="33817664">
+    <w:abstractNumId w:val="98"/>
+  </w:num>
+  <w:num w:numId="15" w16cid:durableId="4402302">
+    <w:abstractNumId w:val="44"/>
+  </w:num>
+  <w:num w:numId="16" w16cid:durableId="878661525">
     <w:abstractNumId w:val="34"/>
   </w:num>
-  <w:num w:numId="3" w16cid:durableId="2008745667">
+  <w:num w:numId="17" w16cid:durableId="2063215834">
+    <w:abstractNumId w:val="47"/>
+  </w:num>
+  <w:num w:numId="18" w16cid:durableId="1617759753">
+    <w:abstractNumId w:val="63"/>
+  </w:num>
+  <w:num w:numId="19" w16cid:durableId="986324453">
+    <w:abstractNumId w:val="39"/>
+  </w:num>
+  <w:num w:numId="20" w16cid:durableId="1750535260">
+    <w:abstractNumId w:val="20"/>
+  </w:num>
+  <w:num w:numId="21" w16cid:durableId="126629186">
+    <w:abstractNumId w:val="53"/>
+  </w:num>
+  <w:num w:numId="22" w16cid:durableId="11228731">
+    <w:abstractNumId w:val="70"/>
+  </w:num>
+  <w:num w:numId="23" w16cid:durableId="1862280573">
+    <w:abstractNumId w:val="65"/>
+  </w:num>
+  <w:num w:numId="24" w16cid:durableId="458229566">
+    <w:abstractNumId w:val="86"/>
+  </w:num>
+  <w:num w:numId="25" w16cid:durableId="356277749">
+    <w:abstractNumId w:val="6"/>
+  </w:num>
+  <w:num w:numId="26" w16cid:durableId="72170928">
+    <w:abstractNumId w:val="71"/>
+  </w:num>
+  <w:num w:numId="27" w16cid:durableId="156726007">
+    <w:abstractNumId w:val="64"/>
+  </w:num>
+  <w:num w:numId="28" w16cid:durableId="1306278467">
+    <w:abstractNumId w:val="56"/>
+  </w:num>
+  <w:num w:numId="29" w16cid:durableId="1979189332">
+    <w:abstractNumId w:val="62"/>
+  </w:num>
+  <w:num w:numId="30" w16cid:durableId="621543974">
+    <w:abstractNumId w:val="15"/>
+  </w:num>
+  <w:num w:numId="31" w16cid:durableId="29654427">
+    <w:abstractNumId w:val="28"/>
+  </w:num>
+  <w:num w:numId="32" w16cid:durableId="1581408164">
+    <w:abstractNumId w:val="95"/>
+  </w:num>
+  <w:num w:numId="33" w16cid:durableId="2069374761">
+    <w:abstractNumId w:val="61"/>
+  </w:num>
+  <w:num w:numId="34" w16cid:durableId="361398191">
+    <w:abstractNumId w:val="14"/>
+  </w:num>
+  <w:num w:numId="35" w16cid:durableId="796918195">
     <w:abstractNumId w:val="18"/>
   </w:num>
-  <w:num w:numId="4" w16cid:durableId="1307508913">
-    <w:abstractNumId w:val="13"/>
+  <w:num w:numId="36" w16cid:durableId="1864592770">
+    <w:abstractNumId w:val="92"/>
   </w:num>
-  <w:num w:numId="5" w16cid:durableId="1138885569">
-    <w:abstractNumId w:val="32"/>
-  </w:num>
-  <w:num w:numId="6" w16cid:durableId="78719073">
-    <w:abstractNumId w:val="16"/>
-  </w:num>
-  <w:num w:numId="7" w16cid:durableId="128981304">
-    <w:abstractNumId w:val="36"/>
-  </w:num>
-  <w:num w:numId="8" w16cid:durableId="298151013">
-    <w:abstractNumId w:val="22"/>
-  </w:num>
-  <w:num w:numId="9" w16cid:durableId="895629376">
-    <w:abstractNumId w:val="26"/>
-  </w:num>
-  <w:num w:numId="10" w16cid:durableId="90660721">
-    <w:abstractNumId w:val="24"/>
-  </w:num>
-  <w:num w:numId="11" w16cid:durableId="1394623328">
-    <w:abstractNumId w:val="43"/>
-  </w:num>
-  <w:num w:numId="12" w16cid:durableId="1714840833">
+  <w:num w:numId="37" w16cid:durableId="1360738295">
     <w:abstractNumId w:val="78"/>
   </w:num>
-  <w:num w:numId="13" w16cid:durableId="991055973">
-    <w:abstractNumId w:val="20"/>
+  <w:num w:numId="38" w16cid:durableId="80807698">
+    <w:abstractNumId w:val="59"/>
   </w:num>
-  <w:num w:numId="14" w16cid:durableId="33817664">
-    <w:abstractNumId w:val="80"/>
+  <w:num w:numId="39" w16cid:durableId="1479348775">
+    <w:abstractNumId w:val="74"/>
   </w:num>
-  <w:num w:numId="15" w16cid:durableId="4402302">
-    <w:abstractNumId w:val="35"/>
-  </w:num>
-  <w:num w:numId="16" w16cid:durableId="878661525">
-    <w:abstractNumId w:val="28"/>
-  </w:num>
-  <w:num w:numId="17" w16cid:durableId="2063215834">
-    <w:abstractNumId w:val="38"/>
-  </w:num>
-  <w:num w:numId="18" w16cid:durableId="1617759753">
-    <w:abstractNumId w:val="50"/>
-  </w:num>
-  <w:num w:numId="19" w16cid:durableId="986324453">
-    <w:abstractNumId w:val="31"/>
-  </w:num>
-  <w:num w:numId="20" w16cid:durableId="1750535260">
-    <w:abstractNumId w:val="17"/>
-  </w:num>
-  <w:num w:numId="21" w16cid:durableId="126629186">
-    <w:abstractNumId w:val="42"/>
-  </w:num>
-  <w:num w:numId="22" w16cid:durableId="11228731">
-    <w:abstractNumId w:val="56"/>
-  </w:num>
-  <w:num w:numId="23" w16cid:durableId="1862280573">
-    <w:abstractNumId w:val="52"/>
-  </w:num>
-  <w:num w:numId="24" w16cid:durableId="458229566">
-    <w:abstractNumId w:val="71"/>
-  </w:num>
-  <w:num w:numId="25" w16cid:durableId="356277749">
-    <w:abstractNumId w:val="4"/>
-  </w:num>
-  <w:num w:numId="26" w16cid:durableId="72170928">
-    <w:abstractNumId w:val="57"/>
-  </w:num>
-  <w:num w:numId="27" w16cid:durableId="156726007">
-    <w:abstractNumId w:val="51"/>
-  </w:num>
-  <w:num w:numId="28" w16cid:durableId="1306278467">
-    <w:abstractNumId w:val="44"/>
-  </w:num>
-  <w:num w:numId="29" w16cid:durableId="1979189332">
-    <w:abstractNumId w:val="49"/>
-  </w:num>
-  <w:num w:numId="30" w16cid:durableId="621543974">
+  <w:num w:numId="40" w16cid:durableId="2133161029">
     <w:abstractNumId w:val="12"/>
   </w:num>
-  <w:num w:numId="31" w16cid:durableId="29654427">
-    <w:abstractNumId w:val="23"/>
-  </w:num>
-  <w:num w:numId="32" w16cid:durableId="1581408164">
-    <w:abstractNumId w:val="77"/>
-  </w:num>
-  <w:num w:numId="33" w16cid:durableId="2069374761">
-    <w:abstractNumId w:val="48"/>
-  </w:num>
-  <w:num w:numId="34" w16cid:durableId="361398191">
-    <w:abstractNumId w:val="11"/>
-  </w:num>
-  <w:num w:numId="35" w16cid:durableId="796918195">
-    <w:abstractNumId w:val="15"/>
-  </w:num>
-  <w:num w:numId="36" w16cid:durableId="1864592770">
-    <w:abstractNumId w:val="76"/>
-  </w:num>
-  <w:num w:numId="37" w16cid:durableId="1360738295">
-    <w:abstractNumId w:val="63"/>
-  </w:num>
-  <w:num w:numId="38" w16cid:durableId="80807698">
-    <w:abstractNumId w:val="47"/>
-  </w:num>
-  <w:num w:numId="39" w16cid:durableId="1479348775">
-    <w:abstractNumId w:val="60"/>
-  </w:num>
-  <w:num w:numId="40" w16cid:durableId="2133161029">
-    <w:abstractNumId w:val="9"/>
-  </w:num>
   <w:num w:numId="41" w16cid:durableId="215236615">
-    <w:abstractNumId w:val="41"/>
+    <w:abstractNumId w:val="52"/>
   </w:num>
   <w:num w:numId="42" w16cid:durableId="626551456">
     <w:abstractNumId w:val="0"/>
   </w:num>
   <w:num w:numId="43" w16cid:durableId="132262404">
-    <w:abstractNumId w:val="40"/>
+    <w:abstractNumId w:val="50"/>
   </w:num>
   <w:num w:numId="44" w16cid:durableId="80956347">
-    <w:abstractNumId w:val="19"/>
+    <w:abstractNumId w:val="23"/>
   </w:num>
   <w:num w:numId="45" w16cid:durableId="1219899419">
-    <w:abstractNumId w:val="1"/>
+    <w:abstractNumId w:val="2"/>
   </w:num>
   <w:num w:numId="46" w16cid:durableId="2133010080">
-    <w:abstractNumId w:val="27"/>
+    <w:abstractNumId w:val="33"/>
   </w:num>
   <w:num w:numId="47" w16cid:durableId="1073352855">
+    <w:abstractNumId w:val="4"/>
+  </w:num>
+  <w:num w:numId="48" w16cid:durableId="282998457">
+    <w:abstractNumId w:val="35"/>
+  </w:num>
+  <w:num w:numId="49" w16cid:durableId="202334272">
+    <w:abstractNumId w:val="8"/>
+  </w:num>
+  <w:num w:numId="50" w16cid:durableId="29843310">
+    <w:abstractNumId w:val="57"/>
+  </w:num>
+  <w:num w:numId="51" w16cid:durableId="891429865">
+    <w:abstractNumId w:val="46"/>
+  </w:num>
+  <w:num w:numId="52" w16cid:durableId="632558338">
+    <w:abstractNumId w:val="73"/>
+  </w:num>
+  <w:num w:numId="53" w16cid:durableId="404843212">
+    <w:abstractNumId w:val="80"/>
+  </w:num>
+  <w:num w:numId="54" w16cid:durableId="103890898">
+    <w:abstractNumId w:val="68"/>
+  </w:num>
+  <w:num w:numId="55" w16cid:durableId="1312052274">
+    <w:abstractNumId w:val="7"/>
+  </w:num>
+  <w:num w:numId="56" w16cid:durableId="774595769">
+    <w:abstractNumId w:val="58"/>
+  </w:num>
+  <w:num w:numId="57" w16cid:durableId="1897469708">
+    <w:abstractNumId w:val="76"/>
+  </w:num>
+  <w:num w:numId="58" w16cid:durableId="1727215569">
+    <w:abstractNumId w:val="77"/>
+  </w:num>
+  <w:num w:numId="59" w16cid:durableId="278455">
     <w:abstractNumId w:val="3"/>
   </w:num>
-  <w:num w:numId="48" w16cid:durableId="282998457">
-    <w:abstractNumId w:val="29"/>
+  <w:num w:numId="60" w16cid:durableId="1617322399">
+    <w:abstractNumId w:val="10"/>
   </w:num>
-  <w:num w:numId="49" w16cid:durableId="202334272">
-    <w:abstractNumId w:val="6"/>
+  <w:num w:numId="61" w16cid:durableId="304900111">
+    <w:abstractNumId w:val="88"/>
   </w:num>
-  <w:num w:numId="50" w16cid:durableId="29843310">
-    <w:abstractNumId w:val="45"/>
+  <w:num w:numId="62" w16cid:durableId="632369769">
+    <w:abstractNumId w:val="72"/>
   </w:num>
-  <w:num w:numId="51" w16cid:durableId="891429865">
+  <w:num w:numId="63" w16cid:durableId="505095234">
+    <w:abstractNumId w:val="25"/>
+  </w:num>
+  <w:num w:numId="64" w16cid:durableId="1853644743">
+    <w:abstractNumId w:val="17"/>
+  </w:num>
+  <w:num w:numId="65" w16cid:durableId="1612664065">
+    <w:abstractNumId w:val="38"/>
+  </w:num>
+  <w:num w:numId="66" w16cid:durableId="2086684142">
+    <w:abstractNumId w:val="69"/>
+  </w:num>
+  <w:num w:numId="67" w16cid:durableId="2074886040">
+    <w:abstractNumId w:val="90"/>
+  </w:num>
+  <w:num w:numId="68" w16cid:durableId="1568418899">
+    <w:abstractNumId w:val="89"/>
+  </w:num>
+  <w:num w:numId="69" w16cid:durableId="838352545">
+    <w:abstractNumId w:val="41"/>
+  </w:num>
+  <w:num w:numId="70" w16cid:durableId="1773893033">
+    <w:abstractNumId w:val="97"/>
+  </w:num>
+  <w:num w:numId="71" w16cid:durableId="2129230628">
+    <w:abstractNumId w:val="13"/>
+  </w:num>
+  <w:num w:numId="72" w16cid:durableId="221210439">
+    <w:abstractNumId w:val="81"/>
+  </w:num>
+  <w:num w:numId="73" w16cid:durableId="615141647">
+    <w:abstractNumId w:val="85"/>
+  </w:num>
+  <w:num w:numId="74" w16cid:durableId="89159592">
+    <w:abstractNumId w:val="84"/>
+  </w:num>
+  <w:num w:numId="75" w16cid:durableId="1608269411">
+    <w:abstractNumId w:val="31"/>
+  </w:num>
+  <w:num w:numId="76" w16cid:durableId="1353145819">
+    <w:abstractNumId w:val="9"/>
+  </w:num>
+  <w:num w:numId="77" w16cid:durableId="1769764901">
+    <w:abstractNumId w:val="66"/>
+  </w:num>
+  <w:num w:numId="78" w16cid:durableId="1426613890">
+    <w:abstractNumId w:val="91"/>
+  </w:num>
+  <w:num w:numId="79" w16cid:durableId="852452430">
+    <w:abstractNumId w:val="83"/>
+  </w:num>
+  <w:num w:numId="80" w16cid:durableId="1082026463">
+    <w:abstractNumId w:val="48"/>
+  </w:num>
+  <w:num w:numId="81" w16cid:durableId="1192958021">
+    <w:abstractNumId w:val="79"/>
+  </w:num>
+  <w:num w:numId="82" w16cid:durableId="1041786034">
+    <w:abstractNumId w:val="43"/>
+  </w:num>
+  <w:num w:numId="83" w16cid:durableId="82999406">
+    <w:abstractNumId w:val="49"/>
+  </w:num>
+  <w:num w:numId="84" w16cid:durableId="2036073236">
+    <w:abstractNumId w:val="93"/>
+  </w:num>
+  <w:num w:numId="85" w16cid:durableId="922494315">
+    <w:abstractNumId w:val="60"/>
+  </w:num>
+  <w:num w:numId="86" w16cid:durableId="455562515">
+    <w:abstractNumId w:val="30"/>
+  </w:num>
+  <w:num w:numId="87" w16cid:durableId="103615798">
+    <w:abstractNumId w:val="94"/>
+  </w:num>
+  <w:num w:numId="88" w16cid:durableId="991908012">
+    <w:abstractNumId w:val="5"/>
+  </w:num>
+  <w:num w:numId="89" w16cid:durableId="1840269154">
+    <w:abstractNumId w:val="26"/>
+  </w:num>
+  <w:num w:numId="90" w16cid:durableId="620847079">
+    <w:abstractNumId w:val="51"/>
+  </w:num>
+  <w:num w:numId="91" w16cid:durableId="1727677828">
+    <w:abstractNumId w:val="87"/>
+  </w:num>
+  <w:num w:numId="92" w16cid:durableId="1204514464">
+    <w:abstractNumId w:val="21"/>
+  </w:num>
+  <w:num w:numId="93" w16cid:durableId="794568027">
+    <w:abstractNumId w:val="54"/>
+  </w:num>
+  <w:num w:numId="94" w16cid:durableId="1201016033">
+    <w:abstractNumId w:val="75"/>
+  </w:num>
+  <w:num w:numId="95" w16cid:durableId="229930276">
+    <w:abstractNumId w:val="67"/>
+  </w:num>
+  <w:num w:numId="96" w16cid:durableId="1881936283">
     <w:abstractNumId w:val="37"/>
   </w:num>
-  <w:num w:numId="52" w16cid:durableId="632558338">
-    <w:abstractNumId w:val="59"/>
+  <w:num w:numId="97" w16cid:durableId="350106421">
+    <w:abstractNumId w:val="11"/>
   </w:num>
-  <w:num w:numId="53" w16cid:durableId="404843212">
-    <w:abstractNumId w:val="65"/>
+  <w:num w:numId="98" w16cid:durableId="1492794184">
+    <w:abstractNumId w:val="36"/>
   </w:num>
-  <w:num w:numId="54" w16cid:durableId="103890898">
-    <w:abstractNumId w:val="54"/>
-  </w:num>
-  <w:num w:numId="55" w16cid:durableId="1312052274">
-    <w:abstractNumId w:val="5"/>
-  </w:num>
-  <w:num w:numId="56" w16cid:durableId="774595769">
-    <w:abstractNumId w:val="46"/>
-  </w:num>
-  <w:num w:numId="57" w16cid:durableId="1897469708">
-    <w:abstractNumId w:val="61"/>
-  </w:num>
-  <w:num w:numId="58" w16cid:durableId="1727215569">
-    <w:abstractNumId w:val="62"/>
-  </w:num>
-  <w:num w:numId="59" w16cid:durableId="278455">
-    <w:abstractNumId w:val="2"/>
-  </w:num>
-  <w:num w:numId="60" w16cid:durableId="1617322399">
-    <w:abstractNumId w:val="8"/>
-  </w:num>
-  <w:num w:numId="61" w16cid:durableId="304900111">
-    <w:abstractNumId w:val="72"/>
-  </w:num>
-  <w:num w:numId="62" w16cid:durableId="632369769">
-    <w:abstractNumId w:val="58"/>
-  </w:num>
-  <w:num w:numId="63" w16cid:durableId="505095234">
-    <w:abstractNumId w:val="21"/>
-  </w:num>
-  <w:num w:numId="64" w16cid:durableId="1853644743">
-    <w:abstractNumId w:val="14"/>
-  </w:num>
-  <w:num w:numId="65" w16cid:durableId="1612664065">
-    <w:abstractNumId w:val="30"/>
-  </w:num>
-  <w:num w:numId="66" w16cid:durableId="2086684142">
-    <w:abstractNumId w:val="55"/>
-  </w:num>
-  <w:num w:numId="67" w16cid:durableId="2074886040">
-    <w:abstractNumId w:val="74"/>
-  </w:num>
-  <w:num w:numId="68" w16cid:durableId="1568418899">
-    <w:abstractNumId w:val="73"/>
-  </w:num>
-  <w:num w:numId="69" w16cid:durableId="838352545">
-    <w:abstractNumId w:val="33"/>
-  </w:num>
-  <w:num w:numId="70" w16cid:durableId="1773893033">
-    <w:abstractNumId w:val="79"/>
-  </w:num>
-  <w:num w:numId="71" w16cid:durableId="2129230628">
-    <w:abstractNumId w:val="10"/>
-  </w:num>
-  <w:num w:numId="72" w16cid:durableId="221210439">
-    <w:abstractNumId w:val="66"/>
-  </w:num>
-  <w:num w:numId="73" w16cid:durableId="615141647">
-    <w:abstractNumId w:val="70"/>
-  </w:num>
-  <w:num w:numId="74" w16cid:durableId="89159592">
-    <w:abstractNumId w:val="69"/>
-  </w:num>
-  <w:num w:numId="75" w16cid:durableId="1608269411">
-    <w:abstractNumId w:val="25"/>
-  </w:num>
-  <w:num w:numId="76" w16cid:durableId="1353145819">
-    <w:abstractNumId w:val="7"/>
-  </w:num>
-  <w:num w:numId="77" w16cid:durableId="1769764901">
-    <w:abstractNumId w:val="53"/>
-  </w:num>
-  <w:num w:numId="78" w16cid:durableId="1426613890">
-    <w:abstractNumId w:val="75"/>
-  </w:num>
-  <w:num w:numId="79" w16cid:durableId="852452430">
-    <w:abstractNumId w:val="68"/>
-  </w:num>
-  <w:num w:numId="80" w16cid:durableId="1082026463">
-    <w:abstractNumId w:val="39"/>
-  </w:num>
-  <w:num w:numId="81" w16cid:durableId="1192958021">
-    <w:abstractNumId w:val="64"/>
+  <w:num w:numId="99" w16cid:durableId="1360741894">
+    <w:abstractNumId w:val="1"/>
   </w:num>
 </w:numbering>
 </file>

</xml_diff>